<commit_message>
feat: adiciona campos {celularAluno} e {emailAluno} no template do contrato
</commit_message>
<xml_diff>
--- a/lib/templates/contrato_template.docx
+++ b/lib/templates/contrato_template.docx
@@ -1,5 +1,75 @@
 
-<file path=word/document.xml><?xml version="1.0" encoding="utf-8"?>
+<file path=customXml\item1.xml><?xml version="1.0" encoding="utf-8"?>
+<b:Sources xmlns:b="http://schemas.openxmlformats.org/officeDocument/2006/bibliography" xmlns="http://schemas.openxmlformats.org/officeDocument/2006/bibliography" SelectedStyle="\APASixthEditionOfficeOnline.xsl" StyleName="APA" Version="6"/>
+</file>
+
+<file path=customXml\itemProps1.xml><?xml version="1.0" encoding="utf-8"?>
+<ds:datastoreItem xmlns:ds="http://schemas.openxmlformats.org/officeDocument/2006/customXml" ds:itemID="{77CAD40A-37C4-45EB-863E-17792EDB9BB0}">
+  <ds:schemaRefs>
+    <ds:schemaRef ds:uri="http://schemas.openxmlformats.org/officeDocument/2006/bibliography"/>
+  </ds:schemaRefs>
+</ds:datastoreItem>
+</file>
+
+<file path=docProps\app.xml><?xml version="1.0" encoding="utf-8"?>
+<Properties xmlns="http://schemas.openxmlformats.org/officeDocument/2006/extended-properties" xmlns:vt="http://schemas.openxmlformats.org/officeDocument/2006/docPropsVTypes">
+  <Template>Normal</Template>
+  <TotalTime>62</TotalTime>
+  <Pages>6</Pages>
+  <Words>2957</Words>
+  <Characters>15974</Characters>
+  <Application>Microsoft Office Word</Application>
+  <DocSecurity>0</DocSecurity>
+  <Lines>133</Lines>
+  <Paragraphs>37</Paragraphs>
+  <ScaleCrop>false</ScaleCrop>
+  <HeadingPairs>
+    <vt:vector size="4" baseType="variant">
+      <vt:variant>
+        <vt:lpstr>Título</vt:lpstr>
+      </vt:variant>
+      <vt:variant>
+        <vt:i4>1</vt:i4>
+      </vt:variant>
+      <vt:variant>
+        <vt:lpstr>Title</vt:lpstr>
+      </vt:variant>
+      <vt:variant>
+        <vt:i4>1</vt:i4>
+      </vt:variant>
+    </vt:vector>
+  </HeadingPairs>
+  <TitlesOfParts>
+    <vt:vector size="2" baseType="lpstr">
+      <vt:lpstr>Contrato de prestqação de serviços educacionaisque firmam entre si as partes abaixos  identificadas como CONTRATADA empresa de treinamento profissional FERNANDO ANTONIO MARTINS DE OLIVEIRA – ME, com nome fantasia PET CURSOS e inscrita no CNPJ sob  nº</vt:lpstr>
+      <vt:lpstr>Contrato de prestqação de serviços educacionaisque firmam entre si as partes abaixos  identificadas como CONTRATADA empresa de treinamento profissional FERNANDO ANTONIO MARTINS DE OLIVEIRA – ME, com nome fantasia PET CURSOS e inscrita no CNPJ sob  nº</vt:lpstr>
+    </vt:vector>
+  </TitlesOfParts>
+  <Company>House</Company>
+  <LinksUpToDate>false</LinksUpToDate>
+  <CharactersWithSpaces>18894</CharactersWithSpaces>
+  <SharedDoc>false</SharedDoc>
+  <HyperlinksChanged>false</HyperlinksChanged>
+  <AppVersion>16.0000</AppVersion>
+</Properties>
+</file>
+
+<file path=docProps\core.xml><?xml version="1.0" encoding="utf-8"?>
+<cp:coreProperties xmlns:cp="http://schemas.openxmlformats.org/package/2006/metadata/core-properties" xmlns:dc="http://purl.org/dc/elements/1.1/" xmlns:dcterms="http://purl.org/dc/terms/" xmlns:dcmitype="http://purl.org/dc/dcmitype/" xmlns:xsi="http://www.w3.org/2001/XMLSchema-instance">
+  <dc:title>Contrato de prestqação de serviços educacionaisque firmam entre si as partes abaixos  identificadas como CONTRATADA empresa de treinamento profissional FERNANDO ANTONIO MARTINS DE OLIVEIRA – ME, com nome fantasia PET CURSOS e inscrita no CNPJ sob  nº</dc:title>
+  <dc:subject/>
+  <dc:creator>Financeiro Jumper</dc:creator>
+  <cp:keywords/>
+  <dc:description/>
+  <cp:lastModifiedBy>Paola Rafaela</cp:lastModifiedBy>
+  <cp:revision>3</cp:revision>
+  <cp:lastPrinted>2026-05-15T19:34:00Z</cp:lastPrinted>
+  <dcterms:created xsi:type="dcterms:W3CDTF">2026-05-15T21:02:00Z</dcterms:created>
+  <dcterms:modified xsi:type="dcterms:W3CDTF">2026-05-15T21:04:00Z</dcterms:modified>
+</cp:coreProperties>
+</file>
+
+<file path=word\document.xml><?xml version="1.0" encoding="utf-8"?>
 <w:document xmlns:wpc="http://schemas.microsoft.com/office/word/2010/wordprocessingCanvas" xmlns:cx="http://schemas.microsoft.com/office/drawing/2014/chartex" xmlns:cx1="http://schemas.microsoft.com/office/drawing/2015/9/8/chartex" xmlns:cx2="http://schemas.microsoft.com/office/drawing/2015/10/21/chartex" xmlns:cx3="http://schemas.microsoft.com/office/drawing/2016/5/9/chartex" xmlns:cx4="http://schemas.microsoft.com/office/drawing/2016/5/10/chartex" xmlns:cx5="http://schemas.microsoft.com/office/drawing/2016/5/11/chartex" xmlns:cx6="http://schemas.microsoft.com/office/drawing/2016/5/12/chartex" xmlns:cx7="http://schemas.microsoft.com/office/drawing/2016/5/13/chartex" xmlns:cx8="http://schemas.microsoft.com/office/drawing/2016/5/14/chartex" xmlns:mc="http://schemas.openxmlformats.org/markup-compatibility/2006" xmlns:aink="http://schemas.microsoft.com/office/drawing/2016/ink" xmlns:am3d="http://schemas.microsoft.com/office/drawing/2017/model3d" xmlns:o="urn:schemas-microsoft-com:office:office" xmlns:oel="http://schemas.microsoft.com/office/2019/extlst" xmlns:r="http://schemas.openxmlformats.org/officeDocument/2006/relationships" xmlns:m="http://schemas.openxmlformats.org/officeDocument/2006/math" xmlns:v="urn:schemas-microsoft-com:vml" xmlns:wp14="http://schemas.microsoft.com/office/word/2010/wordprocessingDrawing" xmlns:wp="http://schemas.openxmlformats.org/drawingml/2006/wordprocessingDrawing" xmlns:w10="urn:schemas-microsoft-com:office:word" xmlns:w="http://schemas.openxmlformats.org/wordprocessingml/2006/main" xmlns:w14="http://schemas.microsoft.com/office/word/2010/wordml" xmlns:w15="http://schemas.microsoft.com/office/word/2012/wordml" xmlns:w16cex="http://schemas.microsoft.com/office/word/2018/wordml/cex" xmlns:w16cid="http://schemas.microsoft.com/office/word/2016/wordml/cid" xmlns:w16="http://schemas.microsoft.com/office/word/2018/wordml" xmlns:w16du="http://schemas.microsoft.com/office/word/2023/wordml/word16du" xmlns:w16sdtdh="http://schemas.microsoft.com/office/word/2020/wordml/sdtdatahash" xmlns:w16sdtfl="http://schemas.microsoft.com/office/word/2024/wordml/sdtformatlock" xmlns:w16se="http://schemas.microsoft.com/office/word/2015/wordml/symex" xmlns:wpg="http://schemas.microsoft.com/office/word/2010/wordprocessingGroup" xmlns:wpi="http://schemas.microsoft.com/office/word/2010/wordprocessingInk" xmlns:wne="http://schemas.microsoft.com/office/word/2006/wordml" xmlns:wps="http://schemas.microsoft.com/office/word/2010/wordprocessingShape" mc:Ignorable="w14 w15 w16se w16cid w16 w16cex w16sdtdh w16sdtfl w16du wp14">
   <w:body>
     <w:p>
@@ -314,6 +384,38 @@
                 <w:szCs w:val="24"/>
               </w:rPr>
               <w:t>Escola:</w:t>
+            </w:r>
+          </w:p>
+        </w:tc>
+      </w:tr>
+      <w:tr>
+        <w:tc>
+          <w:tcPr>
+            <w:tcW w:w="10063" w:type="dxa"/>
+          </w:tcPr>
+          <w:p>
+            <w:pPr>
+              <w:autoSpaceDE w:val="0"/>
+              <w:autoSpaceDN w:val="0"/>
+              <w:adjustRightInd w:val="0"/>
+              <w:jc w:val="both"/>
+              <w:rPr>
+                <w:rFonts w:ascii="Arial" w:hAnsi="Arial" w:cs="Arial"/>
+                <w:b/>
+                <w:bCs/>
+                <w:sz w:val="24"/>
+                <w:szCs w:val="24"/>
+              </w:rPr>
+            </w:pPr>
+            <w:r>
+              <w:rPr>
+                <w:rFonts w:ascii="Arial" w:hAnsi="Arial" w:cs="Arial"/>
+                <w:b/>
+                <w:bCs/>
+                <w:sz w:val="24"/>
+                <w:szCs w:val="24"/>
+              </w:rPr>
+              <w:t xml:space="preserve">Celular: {celularAluno}                     E-mail: {emailAluno}</w:t>
             </w:r>
           </w:p>
         </w:tc>
@@ -5522,7 +5624,7 @@
 </w:document>
 </file>
 
-<file path=word/endnotes.xml><?xml version="1.0" encoding="utf-8"?>
+<file path=word\endnotes.xml><?xml version="1.0" encoding="utf-8"?>
 <w:endnotes xmlns:wpc="http://schemas.microsoft.com/office/word/2010/wordprocessingCanvas" xmlns:cx="http://schemas.microsoft.com/office/drawing/2014/chartex" xmlns:cx1="http://schemas.microsoft.com/office/drawing/2015/9/8/chartex" xmlns:cx2="http://schemas.microsoft.com/office/drawing/2015/10/21/chartex" xmlns:cx3="http://schemas.microsoft.com/office/drawing/2016/5/9/chartex" xmlns:cx4="http://schemas.microsoft.com/office/drawing/2016/5/10/chartex" xmlns:cx5="http://schemas.microsoft.com/office/drawing/2016/5/11/chartex" xmlns:cx6="http://schemas.microsoft.com/office/drawing/2016/5/12/chartex" xmlns:cx7="http://schemas.microsoft.com/office/drawing/2016/5/13/chartex" xmlns:cx8="http://schemas.microsoft.com/office/drawing/2016/5/14/chartex" xmlns:mc="http://schemas.openxmlformats.org/markup-compatibility/2006" xmlns:aink="http://schemas.microsoft.com/office/drawing/2016/ink" xmlns:am3d="http://schemas.microsoft.com/office/drawing/2017/model3d" xmlns:o="urn:schemas-microsoft-com:office:office" xmlns:oel="http://schemas.microsoft.com/office/2019/extlst" xmlns:r="http://schemas.openxmlformats.org/officeDocument/2006/relationships" xmlns:m="http://schemas.openxmlformats.org/officeDocument/2006/math" xmlns:v="urn:schemas-microsoft-com:vml" xmlns:wp14="http://schemas.microsoft.com/office/word/2010/wordprocessingDrawing" xmlns:wp="http://schemas.openxmlformats.org/drawingml/2006/wordprocessingDrawing" xmlns:w10="urn:schemas-microsoft-com:office:word" xmlns:w="http://schemas.openxmlformats.org/wordprocessingml/2006/main" xmlns:w14="http://schemas.microsoft.com/office/word/2010/wordml" xmlns:w15="http://schemas.microsoft.com/office/word/2012/wordml" xmlns:w16cex="http://schemas.microsoft.com/office/word/2018/wordml/cex" xmlns:w16cid="http://schemas.microsoft.com/office/word/2016/wordml/cid" xmlns:w16="http://schemas.microsoft.com/office/word/2018/wordml" xmlns:w16du="http://schemas.microsoft.com/office/word/2023/wordml/word16du" xmlns:w16sdtdh="http://schemas.microsoft.com/office/word/2020/wordml/sdtdatahash" xmlns:w16sdtfl="http://schemas.microsoft.com/office/word/2024/wordml/sdtformatlock" xmlns:w16se="http://schemas.microsoft.com/office/word/2015/wordml/symex" xmlns:wpg="http://schemas.microsoft.com/office/word/2010/wordprocessingGroup" xmlns:wpi="http://schemas.microsoft.com/office/word/2010/wordprocessingInk" xmlns:wne="http://schemas.microsoft.com/office/word/2006/wordml" xmlns:wps="http://schemas.microsoft.com/office/word/2010/wordprocessingShape" mc:Ignorable="w14 w15 w16se w16cid w16 w16cex w16sdtdh w16sdtfl w16du wp14">
   <w:endnote w:type="separator" w:id="-1">
     <w:p>
@@ -5541,7 +5643,47 @@
 </w:endnotes>
 </file>
 
-<file path=word/footer1.xml><?xml version="1.0" encoding="utf-8"?>
+<file path=word\fontTable.xml><?xml version="1.0" encoding="utf-8"?>
+<w:fonts xmlns:mc="http://schemas.openxmlformats.org/markup-compatibility/2006" xmlns:r="http://schemas.openxmlformats.org/officeDocument/2006/relationships" xmlns:w="http://schemas.openxmlformats.org/wordprocessingml/2006/main" xmlns:w14="http://schemas.microsoft.com/office/word/2010/wordml" xmlns:w15="http://schemas.microsoft.com/office/word/2012/wordml" xmlns:w16cex="http://schemas.microsoft.com/office/word/2018/wordml/cex" xmlns:w16cid="http://schemas.microsoft.com/office/word/2016/wordml/cid" xmlns:w16="http://schemas.microsoft.com/office/word/2018/wordml" xmlns:w16du="http://schemas.microsoft.com/office/word/2023/wordml/word16du" xmlns:w16sdtdh="http://schemas.microsoft.com/office/word/2020/wordml/sdtdatahash" xmlns:w16sdtfl="http://schemas.microsoft.com/office/word/2024/wordml/sdtformatlock" xmlns:w16se="http://schemas.microsoft.com/office/word/2015/wordml/symex" mc:Ignorable="w14 w15 w16se w16cid w16 w16cex w16sdtdh w16sdtfl w16du">
+  <w:font w:name="Times New Roman">
+    <w:panose1 w:val="02020603050405020304"/>
+    <w:charset w:val="00"/>
+    <w:family w:val="roman"/>
+    <w:pitch w:val="variable"/>
+    <w:sig w:usb0="E0002EFF" w:usb1="C000785B" w:usb2="00000009" w:usb3="00000000" w:csb0="000001FF" w:csb1="00000000"/>
+  </w:font>
+  <w:font w:name="Tahoma">
+    <w:panose1 w:val="020B0604030504040204"/>
+    <w:charset w:val="00"/>
+    <w:family w:val="swiss"/>
+    <w:pitch w:val="variable"/>
+    <w:sig w:usb0="E1002EFF" w:usb1="C000605B" w:usb2="00000029" w:usb3="00000000" w:csb0="000101FF" w:csb1="00000000"/>
+  </w:font>
+  <w:font w:name="Arial">
+    <w:panose1 w:val="020B0604020202020204"/>
+    <w:charset w:val="00"/>
+    <w:family w:val="swiss"/>
+    <w:pitch w:val="variable"/>
+    <w:sig w:usb0="E0002EFF" w:usb1="C000785B" w:usb2="00000009" w:usb3="00000000" w:csb0="000001FF" w:csb1="00000000"/>
+  </w:font>
+  <w:font w:name="Calibri Light">
+    <w:panose1 w:val="020F0302020204030204"/>
+    <w:charset w:val="00"/>
+    <w:family w:val="swiss"/>
+    <w:pitch w:val="variable"/>
+    <w:sig w:usb0="E4002EFF" w:usb1="C000247B" w:usb2="00000009" w:usb3="00000000" w:csb0="000001FF" w:csb1="00000000"/>
+  </w:font>
+  <w:font w:name="Calibri">
+    <w:panose1 w:val="020F0502020204030204"/>
+    <w:charset w:val="00"/>
+    <w:family w:val="swiss"/>
+    <w:pitch w:val="variable"/>
+    <w:sig w:usb0="E4002EFF" w:usb1="C000247B" w:usb2="00000009" w:usb3="00000000" w:csb0="000001FF" w:csb1="00000000"/>
+  </w:font>
+</w:fonts>
+</file>
+
+<file path=word\footer1.xml><?xml version="1.0" encoding="utf-8"?>
 <w:ftr xmlns:wpc="http://schemas.microsoft.com/office/word/2010/wordprocessingCanvas" xmlns:cx="http://schemas.microsoft.com/office/drawing/2014/chartex" xmlns:cx1="http://schemas.microsoft.com/office/drawing/2015/9/8/chartex" xmlns:cx2="http://schemas.microsoft.com/office/drawing/2015/10/21/chartex" xmlns:cx3="http://schemas.microsoft.com/office/drawing/2016/5/9/chartex" xmlns:cx4="http://schemas.microsoft.com/office/drawing/2016/5/10/chartex" xmlns:cx5="http://schemas.microsoft.com/office/drawing/2016/5/11/chartex" xmlns:cx6="http://schemas.microsoft.com/office/drawing/2016/5/12/chartex" xmlns:cx7="http://schemas.microsoft.com/office/drawing/2016/5/13/chartex" xmlns:cx8="http://schemas.microsoft.com/office/drawing/2016/5/14/chartex" xmlns:mc="http://schemas.openxmlformats.org/markup-compatibility/2006" xmlns:aink="http://schemas.microsoft.com/office/drawing/2016/ink" xmlns:am3d="http://schemas.microsoft.com/office/drawing/2017/model3d" xmlns:o="urn:schemas-microsoft-com:office:office" xmlns:oel="http://schemas.microsoft.com/office/2019/extlst" xmlns:r="http://schemas.openxmlformats.org/officeDocument/2006/relationships" xmlns:m="http://schemas.openxmlformats.org/officeDocument/2006/math" xmlns:v="urn:schemas-microsoft-com:vml" xmlns:wp14="http://schemas.microsoft.com/office/word/2010/wordprocessingDrawing" xmlns:wp="http://schemas.openxmlformats.org/drawingml/2006/wordprocessingDrawing" xmlns:w10="urn:schemas-microsoft-com:office:word" xmlns:w="http://schemas.openxmlformats.org/wordprocessingml/2006/main" xmlns:w14="http://schemas.microsoft.com/office/word/2010/wordml" xmlns:w15="http://schemas.microsoft.com/office/word/2012/wordml" xmlns:w16cex="http://schemas.microsoft.com/office/word/2018/wordml/cex" xmlns:w16cid="http://schemas.microsoft.com/office/word/2016/wordml/cid" xmlns:w16="http://schemas.microsoft.com/office/word/2018/wordml" xmlns:w16du="http://schemas.microsoft.com/office/word/2023/wordml/word16du" xmlns:w16sdtdh="http://schemas.microsoft.com/office/word/2020/wordml/sdtdatahash" xmlns:w16sdtfl="http://schemas.microsoft.com/office/word/2024/wordml/sdtformatlock" xmlns:w16se="http://schemas.microsoft.com/office/word/2015/wordml/symex" xmlns:wpg="http://schemas.microsoft.com/office/word/2010/wordprocessingGroup" xmlns:wpi="http://schemas.microsoft.com/office/word/2010/wordprocessingInk" xmlns:wne="http://schemas.microsoft.com/office/word/2006/wordml" xmlns:wps="http://schemas.microsoft.com/office/word/2010/wordprocessingShape" mc:Ignorable="w14 w15 w16se w16cid w16 w16cex w16sdtdh w16sdtfl w16du wp14">
   <w:p>
     <w:pPr>
@@ -5579,7 +5721,7 @@
 </w:ftr>
 </file>
 
-<file path=word/footer2.xml><?xml version="1.0" encoding="utf-8"?>
+<file path=word\footer2.xml><?xml version="1.0" encoding="utf-8"?>
 <w:ftr xmlns:wpc="http://schemas.microsoft.com/office/word/2010/wordprocessingCanvas" xmlns:cx="http://schemas.microsoft.com/office/drawing/2014/chartex" xmlns:cx1="http://schemas.microsoft.com/office/drawing/2015/9/8/chartex" xmlns:cx2="http://schemas.microsoft.com/office/drawing/2015/10/21/chartex" xmlns:cx3="http://schemas.microsoft.com/office/drawing/2016/5/9/chartex" xmlns:cx4="http://schemas.microsoft.com/office/drawing/2016/5/10/chartex" xmlns:cx5="http://schemas.microsoft.com/office/drawing/2016/5/11/chartex" xmlns:cx6="http://schemas.microsoft.com/office/drawing/2016/5/12/chartex" xmlns:cx7="http://schemas.microsoft.com/office/drawing/2016/5/13/chartex" xmlns:cx8="http://schemas.microsoft.com/office/drawing/2016/5/14/chartex" xmlns:mc="http://schemas.openxmlformats.org/markup-compatibility/2006" xmlns:aink="http://schemas.microsoft.com/office/drawing/2016/ink" xmlns:am3d="http://schemas.microsoft.com/office/drawing/2017/model3d" xmlns:o="urn:schemas-microsoft-com:office:office" xmlns:oel="http://schemas.microsoft.com/office/2019/extlst" xmlns:r="http://schemas.openxmlformats.org/officeDocument/2006/relationships" xmlns:m="http://schemas.openxmlformats.org/officeDocument/2006/math" xmlns:v="urn:schemas-microsoft-com:vml" xmlns:wp14="http://schemas.microsoft.com/office/word/2010/wordprocessingDrawing" xmlns:wp="http://schemas.openxmlformats.org/drawingml/2006/wordprocessingDrawing" xmlns:w10="urn:schemas-microsoft-com:office:word" xmlns:w="http://schemas.openxmlformats.org/wordprocessingml/2006/main" xmlns:w14="http://schemas.microsoft.com/office/word/2010/wordml" xmlns:w15="http://schemas.microsoft.com/office/word/2012/wordml" xmlns:w16cex="http://schemas.microsoft.com/office/word/2018/wordml/cex" xmlns:w16cid="http://schemas.microsoft.com/office/word/2016/wordml/cid" xmlns:w16="http://schemas.microsoft.com/office/word/2018/wordml" xmlns:w16du="http://schemas.microsoft.com/office/word/2023/wordml/word16du" xmlns:w16sdtdh="http://schemas.microsoft.com/office/word/2020/wordml/sdtdatahash" xmlns:w16sdtfl="http://schemas.microsoft.com/office/word/2024/wordml/sdtformatlock" xmlns:w16se="http://schemas.microsoft.com/office/word/2015/wordml/symex" xmlns:wpg="http://schemas.microsoft.com/office/word/2010/wordprocessingGroup" xmlns:wpi="http://schemas.microsoft.com/office/word/2010/wordprocessingInk" xmlns:wne="http://schemas.microsoft.com/office/word/2006/wordml" xmlns:wps="http://schemas.microsoft.com/office/word/2010/wordprocessingShape" mc:Ignorable="w14 w15 w16se w16cid w16 w16cex w16sdtdh w16sdtfl w16du wp14">
   <w:p>
     <w:pPr>
@@ -5658,7 +5800,7 @@
 </w:ftr>
 </file>
 
-<file path=word/footer3.xml><?xml version="1.0" encoding="utf-8"?>
+<file path=word\footer3.xml><?xml version="1.0" encoding="utf-8"?>
 <w:ftr xmlns:wpc="http://schemas.microsoft.com/office/word/2010/wordprocessingCanvas" xmlns:cx="http://schemas.microsoft.com/office/drawing/2014/chartex" xmlns:cx1="http://schemas.microsoft.com/office/drawing/2015/9/8/chartex" xmlns:cx2="http://schemas.microsoft.com/office/drawing/2015/10/21/chartex" xmlns:cx3="http://schemas.microsoft.com/office/drawing/2016/5/9/chartex" xmlns:cx4="http://schemas.microsoft.com/office/drawing/2016/5/10/chartex" xmlns:cx5="http://schemas.microsoft.com/office/drawing/2016/5/11/chartex" xmlns:cx6="http://schemas.microsoft.com/office/drawing/2016/5/12/chartex" xmlns:cx7="http://schemas.microsoft.com/office/drawing/2016/5/13/chartex" xmlns:cx8="http://schemas.microsoft.com/office/drawing/2016/5/14/chartex" xmlns:mc="http://schemas.openxmlformats.org/markup-compatibility/2006" xmlns:aink="http://schemas.microsoft.com/office/drawing/2016/ink" xmlns:am3d="http://schemas.microsoft.com/office/drawing/2017/model3d" xmlns:o="urn:schemas-microsoft-com:office:office" xmlns:oel="http://schemas.microsoft.com/office/2019/extlst" xmlns:r="http://schemas.openxmlformats.org/officeDocument/2006/relationships" xmlns:m="http://schemas.openxmlformats.org/officeDocument/2006/math" xmlns:v="urn:schemas-microsoft-com:vml" xmlns:wp14="http://schemas.microsoft.com/office/word/2010/wordprocessingDrawing" xmlns:wp="http://schemas.openxmlformats.org/drawingml/2006/wordprocessingDrawing" xmlns:w10="urn:schemas-microsoft-com:office:word" xmlns:w="http://schemas.openxmlformats.org/wordprocessingml/2006/main" xmlns:w14="http://schemas.microsoft.com/office/word/2010/wordml" xmlns:w15="http://schemas.microsoft.com/office/word/2012/wordml" xmlns:w16cex="http://schemas.microsoft.com/office/word/2018/wordml/cex" xmlns:w16cid="http://schemas.microsoft.com/office/word/2016/wordml/cid" xmlns:w16="http://schemas.microsoft.com/office/word/2018/wordml" xmlns:w16du="http://schemas.microsoft.com/office/word/2023/wordml/word16du" xmlns:w16sdtdh="http://schemas.microsoft.com/office/word/2020/wordml/sdtdatahash" xmlns:w16sdtfl="http://schemas.microsoft.com/office/word/2024/wordml/sdtformatlock" xmlns:w16se="http://schemas.microsoft.com/office/word/2015/wordml/symex" xmlns:wpg="http://schemas.microsoft.com/office/word/2010/wordprocessingGroup" xmlns:wpi="http://schemas.microsoft.com/office/word/2010/wordprocessingInk" xmlns:wne="http://schemas.microsoft.com/office/word/2006/wordml" xmlns:wps="http://schemas.microsoft.com/office/word/2010/wordprocessingShape" mc:Ignorable="w14 w15 w16se w16cid w16 w16cex w16sdtdh w16sdtfl w16du wp14">
   <w:p>
     <w:pPr>
@@ -5668,7 +5810,7 @@
 </w:ftr>
 </file>
 
-<file path=word/footnotes.xml><?xml version="1.0" encoding="utf-8"?>
+<file path=word\footnotes.xml><?xml version="1.0" encoding="utf-8"?>
 <w:footnotes xmlns:wpc="http://schemas.microsoft.com/office/word/2010/wordprocessingCanvas" xmlns:cx="http://schemas.microsoft.com/office/drawing/2014/chartex" xmlns:cx1="http://schemas.microsoft.com/office/drawing/2015/9/8/chartex" xmlns:cx2="http://schemas.microsoft.com/office/drawing/2015/10/21/chartex" xmlns:cx3="http://schemas.microsoft.com/office/drawing/2016/5/9/chartex" xmlns:cx4="http://schemas.microsoft.com/office/drawing/2016/5/10/chartex" xmlns:cx5="http://schemas.microsoft.com/office/drawing/2016/5/11/chartex" xmlns:cx6="http://schemas.microsoft.com/office/drawing/2016/5/12/chartex" xmlns:cx7="http://schemas.microsoft.com/office/drawing/2016/5/13/chartex" xmlns:cx8="http://schemas.microsoft.com/office/drawing/2016/5/14/chartex" xmlns:mc="http://schemas.openxmlformats.org/markup-compatibility/2006" xmlns:aink="http://schemas.microsoft.com/office/drawing/2016/ink" xmlns:am3d="http://schemas.microsoft.com/office/drawing/2017/model3d" xmlns:o="urn:schemas-microsoft-com:office:office" xmlns:oel="http://schemas.microsoft.com/office/2019/extlst" xmlns:r="http://schemas.openxmlformats.org/officeDocument/2006/relationships" xmlns:m="http://schemas.openxmlformats.org/officeDocument/2006/math" xmlns:v="urn:schemas-microsoft-com:vml" xmlns:wp14="http://schemas.microsoft.com/office/word/2010/wordprocessingDrawing" xmlns:wp="http://schemas.openxmlformats.org/drawingml/2006/wordprocessingDrawing" xmlns:w10="urn:schemas-microsoft-com:office:word" xmlns:w="http://schemas.openxmlformats.org/wordprocessingml/2006/main" xmlns:w14="http://schemas.microsoft.com/office/word/2010/wordml" xmlns:w15="http://schemas.microsoft.com/office/word/2012/wordml" xmlns:w16cex="http://schemas.microsoft.com/office/word/2018/wordml/cex" xmlns:w16cid="http://schemas.microsoft.com/office/word/2016/wordml/cid" xmlns:w16="http://schemas.microsoft.com/office/word/2018/wordml" xmlns:w16du="http://schemas.microsoft.com/office/word/2023/wordml/word16du" xmlns:w16sdtdh="http://schemas.microsoft.com/office/word/2020/wordml/sdtdatahash" xmlns:w16sdtfl="http://schemas.microsoft.com/office/word/2024/wordml/sdtformatlock" xmlns:w16se="http://schemas.microsoft.com/office/word/2015/wordml/symex" xmlns:wpg="http://schemas.microsoft.com/office/word/2010/wordprocessingGroup" xmlns:wpi="http://schemas.microsoft.com/office/word/2010/wordprocessingInk" xmlns:wne="http://schemas.microsoft.com/office/word/2006/wordml" xmlns:wps="http://schemas.microsoft.com/office/word/2010/wordprocessingShape" mc:Ignorable="w14 w15 w16se w16cid w16 w16cex w16sdtdh w16sdtfl w16du wp14">
   <w:footnote w:type="separator" w:id="-1">
     <w:p>
@@ -5687,7 +5829,7 @@
 </w:footnotes>
 </file>
 
-<file path=word/header1.xml><?xml version="1.0" encoding="utf-8"?>
+<file path=word\header1.xml><?xml version="1.0" encoding="utf-8"?>
 <w:hdr xmlns:wpc="http://schemas.microsoft.com/office/word/2010/wordprocessingCanvas" xmlns:cx="http://schemas.microsoft.com/office/drawing/2014/chartex" xmlns:cx1="http://schemas.microsoft.com/office/drawing/2015/9/8/chartex" xmlns:cx2="http://schemas.microsoft.com/office/drawing/2015/10/21/chartex" xmlns:cx3="http://schemas.microsoft.com/office/drawing/2016/5/9/chartex" xmlns:cx4="http://schemas.microsoft.com/office/drawing/2016/5/10/chartex" xmlns:cx5="http://schemas.microsoft.com/office/drawing/2016/5/11/chartex" xmlns:cx6="http://schemas.microsoft.com/office/drawing/2016/5/12/chartex" xmlns:cx7="http://schemas.microsoft.com/office/drawing/2016/5/13/chartex" xmlns:cx8="http://schemas.microsoft.com/office/drawing/2016/5/14/chartex" xmlns:mc="http://schemas.openxmlformats.org/markup-compatibility/2006" xmlns:aink="http://schemas.microsoft.com/office/drawing/2016/ink" xmlns:am3d="http://schemas.microsoft.com/office/drawing/2017/model3d" xmlns:o="urn:schemas-microsoft-com:office:office" xmlns:oel="http://schemas.microsoft.com/office/2019/extlst" xmlns:r="http://schemas.openxmlformats.org/officeDocument/2006/relationships" xmlns:m="http://schemas.openxmlformats.org/officeDocument/2006/math" xmlns:v="urn:schemas-microsoft-com:vml" xmlns:wp14="http://schemas.microsoft.com/office/word/2010/wordprocessingDrawing" xmlns:wp="http://schemas.openxmlformats.org/drawingml/2006/wordprocessingDrawing" xmlns:w10="urn:schemas-microsoft-com:office:word" xmlns:w="http://schemas.openxmlformats.org/wordprocessingml/2006/main" xmlns:w14="http://schemas.microsoft.com/office/word/2010/wordml" xmlns:w15="http://schemas.microsoft.com/office/word/2012/wordml" xmlns:w16cex="http://schemas.microsoft.com/office/word/2018/wordml/cex" xmlns:w16cid="http://schemas.microsoft.com/office/word/2016/wordml/cid" xmlns:w16="http://schemas.microsoft.com/office/word/2018/wordml" xmlns:w16du="http://schemas.microsoft.com/office/word/2023/wordml/word16du" xmlns:w16sdtdh="http://schemas.microsoft.com/office/word/2020/wordml/sdtdatahash" xmlns:w16sdtfl="http://schemas.microsoft.com/office/word/2024/wordml/sdtformatlock" xmlns:w16se="http://schemas.microsoft.com/office/word/2015/wordml/symex" xmlns:wpg="http://schemas.microsoft.com/office/word/2010/wordprocessingGroup" xmlns:wpi="http://schemas.microsoft.com/office/word/2010/wordprocessingInk" xmlns:wne="http://schemas.microsoft.com/office/word/2006/wordml" xmlns:wps="http://schemas.microsoft.com/office/word/2010/wordprocessingShape" mc:Ignorable="w14 w15 w16se w16cid w16 w16cex w16sdtdh w16sdtfl w16du wp14">
   <w:p>
     <w:pPr>
@@ -5697,7 +5839,7 @@
 </w:hdr>
 </file>
 
-<file path=word/header2.xml><?xml version="1.0" encoding="utf-8"?>
+<file path=word\header2.xml><?xml version="1.0" encoding="utf-8"?>
 <w:hdr xmlns:wpc="http://schemas.microsoft.com/office/word/2010/wordprocessingCanvas" xmlns:cx="http://schemas.microsoft.com/office/drawing/2014/chartex" xmlns:cx1="http://schemas.microsoft.com/office/drawing/2015/9/8/chartex" xmlns:cx2="http://schemas.microsoft.com/office/drawing/2015/10/21/chartex" xmlns:cx3="http://schemas.microsoft.com/office/drawing/2016/5/9/chartex" xmlns:cx4="http://schemas.microsoft.com/office/drawing/2016/5/10/chartex" xmlns:cx5="http://schemas.microsoft.com/office/drawing/2016/5/11/chartex" xmlns:cx6="http://schemas.microsoft.com/office/drawing/2016/5/12/chartex" xmlns:cx7="http://schemas.microsoft.com/office/drawing/2016/5/13/chartex" xmlns:cx8="http://schemas.microsoft.com/office/drawing/2016/5/14/chartex" xmlns:mc="http://schemas.openxmlformats.org/markup-compatibility/2006" xmlns:aink="http://schemas.microsoft.com/office/drawing/2016/ink" xmlns:am3d="http://schemas.microsoft.com/office/drawing/2017/model3d" xmlns:o="urn:schemas-microsoft-com:office:office" xmlns:oel="http://schemas.microsoft.com/office/2019/extlst" xmlns:r="http://schemas.openxmlformats.org/officeDocument/2006/relationships" xmlns:m="http://schemas.openxmlformats.org/officeDocument/2006/math" xmlns:v="urn:schemas-microsoft-com:vml" xmlns:wp14="http://schemas.microsoft.com/office/word/2010/wordprocessingDrawing" xmlns:wp="http://schemas.openxmlformats.org/drawingml/2006/wordprocessingDrawing" xmlns:w10="urn:schemas-microsoft-com:office:word" xmlns:w="http://schemas.openxmlformats.org/wordprocessingml/2006/main" xmlns:w14="http://schemas.microsoft.com/office/word/2010/wordml" xmlns:w15="http://schemas.microsoft.com/office/word/2012/wordml" xmlns:w16cex="http://schemas.microsoft.com/office/word/2018/wordml/cex" xmlns:w16cid="http://schemas.microsoft.com/office/word/2016/wordml/cid" xmlns:w16="http://schemas.microsoft.com/office/word/2018/wordml" xmlns:w16du="http://schemas.microsoft.com/office/word/2023/wordml/word16du" xmlns:w16sdtdh="http://schemas.microsoft.com/office/word/2020/wordml/sdtdatahash" xmlns:w16sdtfl="http://schemas.microsoft.com/office/word/2024/wordml/sdtformatlock" xmlns:w16se="http://schemas.microsoft.com/office/word/2015/wordml/symex" xmlns:wpg="http://schemas.microsoft.com/office/word/2010/wordprocessingGroup" xmlns:wpi="http://schemas.microsoft.com/office/word/2010/wordprocessingInk" xmlns:wne="http://schemas.microsoft.com/office/word/2006/wordml" xmlns:wps="http://schemas.microsoft.com/office/word/2010/wordprocessingShape" mc:Ignorable="w14 w15 w16se w16cid w16 w16cex w16sdtdh w16sdtfl w16du wp14">
   <w:p>
     <w:pPr>
@@ -5712,7 +5854,7 @@
 </w:hdr>
 </file>
 
-<file path=word/header3.xml><?xml version="1.0" encoding="utf-8"?>
+<file path=word\header3.xml><?xml version="1.0" encoding="utf-8"?>
 <w:hdr xmlns:wpc="http://schemas.microsoft.com/office/word/2010/wordprocessingCanvas" xmlns:cx="http://schemas.microsoft.com/office/drawing/2014/chartex" xmlns:cx1="http://schemas.microsoft.com/office/drawing/2015/9/8/chartex" xmlns:cx2="http://schemas.microsoft.com/office/drawing/2015/10/21/chartex" xmlns:cx3="http://schemas.microsoft.com/office/drawing/2016/5/9/chartex" xmlns:cx4="http://schemas.microsoft.com/office/drawing/2016/5/10/chartex" xmlns:cx5="http://schemas.microsoft.com/office/drawing/2016/5/11/chartex" xmlns:cx6="http://schemas.microsoft.com/office/drawing/2016/5/12/chartex" xmlns:cx7="http://schemas.microsoft.com/office/drawing/2016/5/13/chartex" xmlns:cx8="http://schemas.microsoft.com/office/drawing/2016/5/14/chartex" xmlns:mc="http://schemas.openxmlformats.org/markup-compatibility/2006" xmlns:aink="http://schemas.microsoft.com/office/drawing/2016/ink" xmlns:am3d="http://schemas.microsoft.com/office/drawing/2017/model3d" xmlns:o="urn:schemas-microsoft-com:office:office" xmlns:oel="http://schemas.microsoft.com/office/2019/extlst" xmlns:r="http://schemas.openxmlformats.org/officeDocument/2006/relationships" xmlns:m="http://schemas.openxmlformats.org/officeDocument/2006/math" xmlns:v="urn:schemas-microsoft-com:vml" xmlns:wp14="http://schemas.microsoft.com/office/word/2010/wordprocessingDrawing" xmlns:wp="http://schemas.openxmlformats.org/drawingml/2006/wordprocessingDrawing" xmlns:w10="urn:schemas-microsoft-com:office:word" xmlns:w="http://schemas.openxmlformats.org/wordprocessingml/2006/main" xmlns:w14="http://schemas.microsoft.com/office/word/2010/wordml" xmlns:w15="http://schemas.microsoft.com/office/word/2012/wordml" xmlns:w16cex="http://schemas.microsoft.com/office/word/2018/wordml/cex" xmlns:w16cid="http://schemas.microsoft.com/office/word/2016/wordml/cid" xmlns:w16="http://schemas.microsoft.com/office/word/2018/wordml" xmlns:w16du="http://schemas.microsoft.com/office/word/2023/wordml/word16du" xmlns:w16sdtdh="http://schemas.microsoft.com/office/word/2020/wordml/sdtdatahash" xmlns:w16sdtfl="http://schemas.microsoft.com/office/word/2024/wordml/sdtformatlock" xmlns:w16se="http://schemas.microsoft.com/office/word/2015/wordml/symex" xmlns:wpg="http://schemas.microsoft.com/office/word/2010/wordprocessingGroup" xmlns:wpi="http://schemas.microsoft.com/office/word/2010/wordprocessingInk" xmlns:wne="http://schemas.microsoft.com/office/word/2006/wordml" xmlns:wps="http://schemas.microsoft.com/office/word/2010/wordprocessingShape" mc:Ignorable="w14 w15 w16se w16cid w16 w16cex w16sdtdh w16sdtfl w16du wp14">
   <w:p>
     <w:pPr>
@@ -5722,7 +5864,7 @@
 </w:hdr>
 </file>
 
-<file path=word/numbering.xml><?xml version="1.0" encoding="utf-8"?>
+<file path=word\numbering.xml><?xml version="1.0" encoding="utf-8"?>
 <w:numbering xmlns:wpc="http://schemas.microsoft.com/office/word/2010/wordprocessingCanvas" xmlns:cx="http://schemas.microsoft.com/office/drawing/2014/chartex" xmlns:cx1="http://schemas.microsoft.com/office/drawing/2015/9/8/chartex" xmlns:cx2="http://schemas.microsoft.com/office/drawing/2015/10/21/chartex" xmlns:cx3="http://schemas.microsoft.com/office/drawing/2016/5/9/chartex" xmlns:cx4="http://schemas.microsoft.com/office/drawing/2016/5/10/chartex" xmlns:cx5="http://schemas.microsoft.com/office/drawing/2016/5/11/chartex" xmlns:cx6="http://schemas.microsoft.com/office/drawing/2016/5/12/chartex" xmlns:cx7="http://schemas.microsoft.com/office/drawing/2016/5/13/chartex" xmlns:cx8="http://schemas.microsoft.com/office/drawing/2016/5/14/chartex" xmlns:mc="http://schemas.openxmlformats.org/markup-compatibility/2006" xmlns:aink="http://schemas.microsoft.com/office/drawing/2016/ink" xmlns:am3d="http://schemas.microsoft.com/office/drawing/2017/model3d" xmlns:o="urn:schemas-microsoft-com:office:office" xmlns:oel="http://schemas.microsoft.com/office/2019/extlst" xmlns:r="http://schemas.openxmlformats.org/officeDocument/2006/relationships" xmlns:m="http://schemas.openxmlformats.org/officeDocument/2006/math" xmlns:v="urn:schemas-microsoft-com:vml" xmlns:wp14="http://schemas.microsoft.com/office/word/2010/wordprocessingDrawing" xmlns:wp="http://schemas.openxmlformats.org/drawingml/2006/wordprocessingDrawing" xmlns:w10="urn:schemas-microsoft-com:office:word" xmlns:w="http://schemas.openxmlformats.org/wordprocessingml/2006/main" xmlns:w14="http://schemas.microsoft.com/office/word/2010/wordml" xmlns:w15="http://schemas.microsoft.com/office/word/2012/wordml" xmlns:w16cex="http://schemas.microsoft.com/office/word/2018/wordml/cex" xmlns:w16cid="http://schemas.microsoft.com/office/word/2016/wordml/cid" xmlns:w16="http://schemas.microsoft.com/office/word/2018/wordml" xmlns:w16du="http://schemas.microsoft.com/office/word/2023/wordml/word16du" xmlns:w16sdtdh="http://schemas.microsoft.com/office/word/2020/wordml/sdtdatahash" xmlns:w16sdtfl="http://schemas.microsoft.com/office/word/2024/wordml/sdtformatlock" xmlns:w16se="http://schemas.microsoft.com/office/word/2015/wordml/symex" xmlns:wpg="http://schemas.microsoft.com/office/word/2010/wordprocessingGroup" xmlns:wpi="http://schemas.microsoft.com/office/word/2010/wordprocessingInk" xmlns:wne="http://schemas.microsoft.com/office/word/2006/wordml" xmlns:wps="http://schemas.microsoft.com/office/word/2010/wordprocessingShape" mc:Ignorable="w14 w15 w16se w16cid w16 w16cex w16sdtdh w16sdtfl w16du wp14">
   <w:abstractNum w:abstractNumId="0" w15:restartNumberingAfterBreak="0">
     <w:nsid w:val="0EBD1D77"/>
@@ -7697,7 +7839,894 @@
 </w:numbering>
 </file>
 
-<file path=word/styles.xml><?xml version="1.0" encoding="utf-8"?>
+<file path=word\settings.xml><?xml version="1.0" encoding="utf-8"?>
+<w:settings xmlns:mc="http://schemas.openxmlformats.org/markup-compatibility/2006" xmlns:o="urn:schemas-microsoft-com:office:office" xmlns:r="http://schemas.openxmlformats.org/officeDocument/2006/relationships" xmlns:m="http://schemas.openxmlformats.org/officeDocument/2006/math" xmlns:v="urn:schemas-microsoft-com:vml" xmlns:w10="urn:schemas-microsoft-com:office:word" xmlns:w="http://schemas.openxmlformats.org/wordprocessingml/2006/main" xmlns:w14="http://schemas.microsoft.com/office/word/2010/wordml" xmlns:w15="http://schemas.microsoft.com/office/word/2012/wordml" xmlns:w16cex="http://schemas.microsoft.com/office/word/2018/wordml/cex" xmlns:w16cid="http://schemas.microsoft.com/office/word/2016/wordml/cid" xmlns:w16="http://schemas.microsoft.com/office/word/2018/wordml" xmlns:w16du="http://schemas.microsoft.com/office/word/2023/wordml/word16du" xmlns:w16sdtdh="http://schemas.microsoft.com/office/word/2020/wordml/sdtdatahash" xmlns:w16sdtfl="http://schemas.microsoft.com/office/word/2024/wordml/sdtformatlock" xmlns:w16se="http://schemas.microsoft.com/office/word/2015/wordml/symex" xmlns:sl="http://schemas.openxmlformats.org/schemaLibrary/2006/main" mc:Ignorable="w14 w15 w16se w16cid w16 w16cex w16sdtdh w16sdtfl w16du">
+  <w:zoom w:percent="100"/>
+  <w:embedSystemFonts/>
+  <w:proofState w:spelling="clean" w:grammar="clean"/>
+  <w:stylePaneFormatFilter w:val="3F01" w:allStyles="1" w:customStyles="0" w:latentStyles="0" w:stylesInUse="0" w:headingStyles="0" w:numberingStyles="0" w:tableStyles="0" w:directFormattingOnRuns="1" w:directFormattingOnParagraphs="1" w:directFormattingOnNumbering="1" w:directFormattingOnTables="1" w:clearFormatting="1" w:top3HeadingStyles="1" w:visibleStyles="0" w:alternateStyleNames="0"/>
+  <w:defaultTabStop w:val="708"/>
+  <w:hyphenationZone w:val="425"/>
+  <w:displayHorizontalDrawingGridEvery w:val="0"/>
+  <w:displayVerticalDrawingGridEvery w:val="0"/>
+  <w:doNotUseMarginsForDrawingGridOrigin/>
+  <w:noPunctuationKerning/>
+  <w:characterSpacingControl w:val="doNotCompress"/>
+  <w:footnotePr>
+    <w:footnote w:id="-1"/>
+    <w:footnote w:id="0"/>
+  </w:footnotePr>
+  <w:endnotePr>
+    <w:endnote w:id="-1"/>
+    <w:endnote w:id="0"/>
+  </w:endnotePr>
+  <w:compat>
+    <w:compatSetting w:name="compatibilityMode" w:uri="http://schemas.microsoft.com/office/word" w:val="15"/>
+    <w:compatSetting w:name="overrideTableStyleFontSizeAndJustification" w:uri="http://schemas.microsoft.com/office/word" w:val="1"/>
+    <w:compatSetting w:name="enableOpenTypeFeatures" w:uri="http://schemas.microsoft.com/office/word" w:val="1"/>
+    <w:compatSetting w:name="doNotFlipMirrorIndents" w:uri="http://schemas.microsoft.com/office/word" w:val="1"/>
+    <w:compatSetting w:name="differentiateMultirowTableHeaders" w:uri="http://schemas.microsoft.com/office/word" w:val="1"/>
+    <w:compatSetting w:name="useWord2013TrackBottomHyphenation" w:uri="http://schemas.microsoft.com/office/word" w:val="1"/>
+  </w:compat>
+  <w:rsids>
+    <w:rsidRoot w:val="00301E16"/>
+    <w:rsid w:val="0000019A"/>
+    <w:rsid w:val="000028D8"/>
+    <w:rsid w:val="000029C5"/>
+    <w:rsid w:val="00004692"/>
+    <w:rsid w:val="000046B4"/>
+    <w:rsid w:val="00004AC5"/>
+    <w:rsid w:val="000054D3"/>
+    <w:rsid w:val="00006CA4"/>
+    <w:rsid w:val="00007587"/>
+    <w:rsid w:val="000231ED"/>
+    <w:rsid w:val="00023CBF"/>
+    <w:rsid w:val="00023DC2"/>
+    <w:rsid w:val="000256F2"/>
+    <w:rsid w:val="00027A0D"/>
+    <w:rsid w:val="00031B2F"/>
+    <w:rsid w:val="00032273"/>
+    <w:rsid w:val="000454DA"/>
+    <w:rsid w:val="0006295D"/>
+    <w:rsid w:val="000665FB"/>
+    <w:rsid w:val="00067A63"/>
+    <w:rsid w:val="00072D9F"/>
+    <w:rsid w:val="00072F43"/>
+    <w:rsid w:val="000744BA"/>
+    <w:rsid w:val="00076B39"/>
+    <w:rsid w:val="00077021"/>
+    <w:rsid w:val="00080D1E"/>
+    <w:rsid w:val="00081832"/>
+    <w:rsid w:val="0008283C"/>
+    <w:rsid w:val="00082D9E"/>
+    <w:rsid w:val="0008603E"/>
+    <w:rsid w:val="00087DCD"/>
+    <w:rsid w:val="00090F33"/>
+    <w:rsid w:val="00095183"/>
+    <w:rsid w:val="000A0D40"/>
+    <w:rsid w:val="000A73D9"/>
+    <w:rsid w:val="000B074A"/>
+    <w:rsid w:val="000B6CE3"/>
+    <w:rsid w:val="000C1F8D"/>
+    <w:rsid w:val="000C4345"/>
+    <w:rsid w:val="000D2BDE"/>
+    <w:rsid w:val="000D4349"/>
+    <w:rsid w:val="000D4E36"/>
+    <w:rsid w:val="000D64EC"/>
+    <w:rsid w:val="000E0247"/>
+    <w:rsid w:val="000E3CFC"/>
+    <w:rsid w:val="000E46BE"/>
+    <w:rsid w:val="000F1705"/>
+    <w:rsid w:val="000F249E"/>
+    <w:rsid w:val="000F2DBA"/>
+    <w:rsid w:val="000F6EC8"/>
+    <w:rsid w:val="0010457D"/>
+    <w:rsid w:val="001124BB"/>
+    <w:rsid w:val="00112DF4"/>
+    <w:rsid w:val="0011475B"/>
+    <w:rsid w:val="00125707"/>
+    <w:rsid w:val="00127620"/>
+    <w:rsid w:val="00133ECA"/>
+    <w:rsid w:val="00134054"/>
+    <w:rsid w:val="00134A02"/>
+    <w:rsid w:val="00142366"/>
+    <w:rsid w:val="0015311D"/>
+    <w:rsid w:val="001534EC"/>
+    <w:rsid w:val="00160FE6"/>
+    <w:rsid w:val="0017122D"/>
+    <w:rsid w:val="0017151A"/>
+    <w:rsid w:val="00171BB8"/>
+    <w:rsid w:val="001723DD"/>
+    <w:rsid w:val="001725A7"/>
+    <w:rsid w:val="0017353B"/>
+    <w:rsid w:val="00175FE2"/>
+    <w:rsid w:val="001865C0"/>
+    <w:rsid w:val="0019290C"/>
+    <w:rsid w:val="001935FF"/>
+    <w:rsid w:val="00193EDB"/>
+    <w:rsid w:val="001A0BE4"/>
+    <w:rsid w:val="001A558F"/>
+    <w:rsid w:val="001B4489"/>
+    <w:rsid w:val="001B664B"/>
+    <w:rsid w:val="001C55A8"/>
+    <w:rsid w:val="001D09B2"/>
+    <w:rsid w:val="001D2415"/>
+    <w:rsid w:val="001D2456"/>
+    <w:rsid w:val="001D5247"/>
+    <w:rsid w:val="001D6156"/>
+    <w:rsid w:val="001E3D15"/>
+    <w:rsid w:val="001E3D48"/>
+    <w:rsid w:val="001E60E2"/>
+    <w:rsid w:val="001E67FC"/>
+    <w:rsid w:val="001E7364"/>
+    <w:rsid w:val="001F0335"/>
+    <w:rsid w:val="001F2689"/>
+    <w:rsid w:val="001F2C3E"/>
+    <w:rsid w:val="001F48B5"/>
+    <w:rsid w:val="00200CA1"/>
+    <w:rsid w:val="00201452"/>
+    <w:rsid w:val="00201CCA"/>
+    <w:rsid w:val="0020289F"/>
+    <w:rsid w:val="002054C1"/>
+    <w:rsid w:val="00206B88"/>
+    <w:rsid w:val="00210FA2"/>
+    <w:rsid w:val="002112C8"/>
+    <w:rsid w:val="00221338"/>
+    <w:rsid w:val="00231237"/>
+    <w:rsid w:val="00240744"/>
+    <w:rsid w:val="002415E2"/>
+    <w:rsid w:val="00242673"/>
+    <w:rsid w:val="0024331E"/>
+    <w:rsid w:val="00243BCA"/>
+    <w:rsid w:val="00245986"/>
+    <w:rsid w:val="00250F69"/>
+    <w:rsid w:val="00251822"/>
+    <w:rsid w:val="00253005"/>
+    <w:rsid w:val="00253900"/>
+    <w:rsid w:val="002549A0"/>
+    <w:rsid w:val="0025503F"/>
+    <w:rsid w:val="00257F19"/>
+    <w:rsid w:val="002609A1"/>
+    <w:rsid w:val="0027160C"/>
+    <w:rsid w:val="00274C05"/>
+    <w:rsid w:val="0027641B"/>
+    <w:rsid w:val="002776E3"/>
+    <w:rsid w:val="00277A0F"/>
+    <w:rsid w:val="00280AD1"/>
+    <w:rsid w:val="0028152A"/>
+    <w:rsid w:val="002823EA"/>
+    <w:rsid w:val="00286930"/>
+    <w:rsid w:val="00294E33"/>
+    <w:rsid w:val="002972BC"/>
+    <w:rsid w:val="002A0452"/>
+    <w:rsid w:val="002A2011"/>
+    <w:rsid w:val="002A37F4"/>
+    <w:rsid w:val="002A3DD1"/>
+    <w:rsid w:val="002A6A35"/>
+    <w:rsid w:val="002B5165"/>
+    <w:rsid w:val="002C2048"/>
+    <w:rsid w:val="002D30F4"/>
+    <w:rsid w:val="002D3D19"/>
+    <w:rsid w:val="002D692B"/>
+    <w:rsid w:val="002D6EE4"/>
+    <w:rsid w:val="002D7F36"/>
+    <w:rsid w:val="002E2FF2"/>
+    <w:rsid w:val="002E5C26"/>
+    <w:rsid w:val="002F0983"/>
+    <w:rsid w:val="002F29CF"/>
+    <w:rsid w:val="002F3F4A"/>
+    <w:rsid w:val="002F571D"/>
+    <w:rsid w:val="002F62A6"/>
+    <w:rsid w:val="002F6D43"/>
+    <w:rsid w:val="003001FC"/>
+    <w:rsid w:val="00301E16"/>
+    <w:rsid w:val="00304489"/>
+    <w:rsid w:val="0031699E"/>
+    <w:rsid w:val="00321A7C"/>
+    <w:rsid w:val="00322390"/>
+    <w:rsid w:val="00323BBA"/>
+    <w:rsid w:val="003243DD"/>
+    <w:rsid w:val="0032443C"/>
+    <w:rsid w:val="00327FA1"/>
+    <w:rsid w:val="0033115D"/>
+    <w:rsid w:val="00334FDC"/>
+    <w:rsid w:val="00344077"/>
+    <w:rsid w:val="003479F4"/>
+    <w:rsid w:val="00351CB3"/>
+    <w:rsid w:val="00353639"/>
+    <w:rsid w:val="0035763F"/>
+    <w:rsid w:val="003625C6"/>
+    <w:rsid w:val="00363B2B"/>
+    <w:rsid w:val="0036709E"/>
+    <w:rsid w:val="0037047F"/>
+    <w:rsid w:val="00375EF4"/>
+    <w:rsid w:val="0038118F"/>
+    <w:rsid w:val="00387912"/>
+    <w:rsid w:val="0039163D"/>
+    <w:rsid w:val="00396260"/>
+    <w:rsid w:val="00397BF3"/>
+    <w:rsid w:val="003A2165"/>
+    <w:rsid w:val="003A3593"/>
+    <w:rsid w:val="003A3F05"/>
+    <w:rsid w:val="003A47C4"/>
+    <w:rsid w:val="003A6D0C"/>
+    <w:rsid w:val="003B61CD"/>
+    <w:rsid w:val="003C17BD"/>
+    <w:rsid w:val="003C21E6"/>
+    <w:rsid w:val="003C45E5"/>
+    <w:rsid w:val="003C4852"/>
+    <w:rsid w:val="003C506C"/>
+    <w:rsid w:val="003C5241"/>
+    <w:rsid w:val="003C61DC"/>
+    <w:rsid w:val="003C64D0"/>
+    <w:rsid w:val="003D0CE2"/>
+    <w:rsid w:val="003D11D4"/>
+    <w:rsid w:val="003D26E9"/>
+    <w:rsid w:val="003D2FAF"/>
+    <w:rsid w:val="003D4A91"/>
+    <w:rsid w:val="003E16AD"/>
+    <w:rsid w:val="003E1DDF"/>
+    <w:rsid w:val="003E6770"/>
+    <w:rsid w:val="003F1B20"/>
+    <w:rsid w:val="003F255C"/>
+    <w:rsid w:val="003F38DE"/>
+    <w:rsid w:val="003F4410"/>
+    <w:rsid w:val="003F4D5A"/>
+    <w:rsid w:val="003F68DA"/>
+    <w:rsid w:val="003F6D60"/>
+    <w:rsid w:val="0040097E"/>
+    <w:rsid w:val="00403376"/>
+    <w:rsid w:val="0040351C"/>
+    <w:rsid w:val="00403DC6"/>
+    <w:rsid w:val="004044FD"/>
+    <w:rsid w:val="004065BA"/>
+    <w:rsid w:val="00416CD3"/>
+    <w:rsid w:val="00417C82"/>
+    <w:rsid w:val="00417D8A"/>
+    <w:rsid w:val="0042113D"/>
+    <w:rsid w:val="00421344"/>
+    <w:rsid w:val="004258A7"/>
+    <w:rsid w:val="00426D06"/>
+    <w:rsid w:val="00431E08"/>
+    <w:rsid w:val="00433130"/>
+    <w:rsid w:val="00434A62"/>
+    <w:rsid w:val="004361A1"/>
+    <w:rsid w:val="00440A83"/>
+    <w:rsid w:val="00465F74"/>
+    <w:rsid w:val="00470FE8"/>
+    <w:rsid w:val="00472D16"/>
+    <w:rsid w:val="00474302"/>
+    <w:rsid w:val="00482E7A"/>
+    <w:rsid w:val="00483598"/>
+    <w:rsid w:val="004876ED"/>
+    <w:rsid w:val="00492E56"/>
+    <w:rsid w:val="00494988"/>
+    <w:rsid w:val="004A37AB"/>
+    <w:rsid w:val="004A5798"/>
+    <w:rsid w:val="004A5883"/>
+    <w:rsid w:val="004A6994"/>
+    <w:rsid w:val="004B6EE0"/>
+    <w:rsid w:val="004B767F"/>
+    <w:rsid w:val="004B7DA7"/>
+    <w:rsid w:val="004C0470"/>
+    <w:rsid w:val="004C41BE"/>
+    <w:rsid w:val="004C464A"/>
+    <w:rsid w:val="004D205D"/>
+    <w:rsid w:val="004D21A6"/>
+    <w:rsid w:val="004D4F73"/>
+    <w:rsid w:val="004E0359"/>
+    <w:rsid w:val="004E28FB"/>
+    <w:rsid w:val="004E3E0B"/>
+    <w:rsid w:val="004F23F1"/>
+    <w:rsid w:val="004F4842"/>
+    <w:rsid w:val="004F5BBF"/>
+    <w:rsid w:val="005015C0"/>
+    <w:rsid w:val="0050280C"/>
+    <w:rsid w:val="005040A8"/>
+    <w:rsid w:val="005040EC"/>
+    <w:rsid w:val="005068A1"/>
+    <w:rsid w:val="005142E8"/>
+    <w:rsid w:val="00514BE7"/>
+    <w:rsid w:val="00517DF3"/>
+    <w:rsid w:val="0052225A"/>
+    <w:rsid w:val="005231CF"/>
+    <w:rsid w:val="005236FB"/>
+    <w:rsid w:val="0052727D"/>
+    <w:rsid w:val="0053007B"/>
+    <w:rsid w:val="0053133E"/>
+    <w:rsid w:val="0053184B"/>
+    <w:rsid w:val="00531913"/>
+    <w:rsid w:val="005377C4"/>
+    <w:rsid w:val="005411F6"/>
+    <w:rsid w:val="00546A08"/>
+    <w:rsid w:val="005475B8"/>
+    <w:rsid w:val="00552034"/>
+    <w:rsid w:val="00555948"/>
+    <w:rsid w:val="00555D5B"/>
+    <w:rsid w:val="0055656A"/>
+    <w:rsid w:val="005570C4"/>
+    <w:rsid w:val="00560D23"/>
+    <w:rsid w:val="00562B82"/>
+    <w:rsid w:val="00562C60"/>
+    <w:rsid w:val="00563CBF"/>
+    <w:rsid w:val="00565C4C"/>
+    <w:rsid w:val="005670EC"/>
+    <w:rsid w:val="00567B49"/>
+    <w:rsid w:val="00567BAE"/>
+    <w:rsid w:val="005701B5"/>
+    <w:rsid w:val="00571674"/>
+    <w:rsid w:val="00571698"/>
+    <w:rsid w:val="00573DB6"/>
+    <w:rsid w:val="00575D3D"/>
+    <w:rsid w:val="00591EA7"/>
+    <w:rsid w:val="00592065"/>
+    <w:rsid w:val="00594FC5"/>
+    <w:rsid w:val="005971A0"/>
+    <w:rsid w:val="005A0568"/>
+    <w:rsid w:val="005C0FB4"/>
+    <w:rsid w:val="005C18E1"/>
+    <w:rsid w:val="005C3AA4"/>
+    <w:rsid w:val="005C71AF"/>
+    <w:rsid w:val="005D0D62"/>
+    <w:rsid w:val="005D38A9"/>
+    <w:rsid w:val="005D759E"/>
+    <w:rsid w:val="005E086A"/>
+    <w:rsid w:val="005E7D1B"/>
+    <w:rsid w:val="005E7F75"/>
+    <w:rsid w:val="005F0FDC"/>
+    <w:rsid w:val="005F53EF"/>
+    <w:rsid w:val="00602F0E"/>
+    <w:rsid w:val="00603D19"/>
+    <w:rsid w:val="00604235"/>
+    <w:rsid w:val="006053E4"/>
+    <w:rsid w:val="00607E3F"/>
+    <w:rsid w:val="006100F9"/>
+    <w:rsid w:val="00612568"/>
+    <w:rsid w:val="006210B2"/>
+    <w:rsid w:val="00624ACD"/>
+    <w:rsid w:val="00627B5D"/>
+    <w:rsid w:val="00634735"/>
+    <w:rsid w:val="00642076"/>
+    <w:rsid w:val="00643BAA"/>
+    <w:rsid w:val="00643E69"/>
+    <w:rsid w:val="00646C74"/>
+    <w:rsid w:val="006477E2"/>
+    <w:rsid w:val="00650788"/>
+    <w:rsid w:val="00650B21"/>
+    <w:rsid w:val="00652247"/>
+    <w:rsid w:val="00653C02"/>
+    <w:rsid w:val="006542AC"/>
+    <w:rsid w:val="00657375"/>
+    <w:rsid w:val="00662D70"/>
+    <w:rsid w:val="00662F8E"/>
+    <w:rsid w:val="00663BDF"/>
+    <w:rsid w:val="006653AE"/>
+    <w:rsid w:val="006656DE"/>
+    <w:rsid w:val="00665FF1"/>
+    <w:rsid w:val="0067037D"/>
+    <w:rsid w:val="00671049"/>
+    <w:rsid w:val="00675F5B"/>
+    <w:rsid w:val="00676089"/>
+    <w:rsid w:val="00676262"/>
+    <w:rsid w:val="00677819"/>
+    <w:rsid w:val="00680780"/>
+    <w:rsid w:val="006855AD"/>
+    <w:rsid w:val="0068726A"/>
+    <w:rsid w:val="00687739"/>
+    <w:rsid w:val="00693B0D"/>
+    <w:rsid w:val="00694EA2"/>
+    <w:rsid w:val="00695F50"/>
+    <w:rsid w:val="006A1E97"/>
+    <w:rsid w:val="006A539D"/>
+    <w:rsid w:val="006A58BB"/>
+    <w:rsid w:val="006A68C8"/>
+    <w:rsid w:val="006A7F50"/>
+    <w:rsid w:val="006B357D"/>
+    <w:rsid w:val="006B43EF"/>
+    <w:rsid w:val="006B56C8"/>
+    <w:rsid w:val="006B5DDE"/>
+    <w:rsid w:val="006B6272"/>
+    <w:rsid w:val="006C06A4"/>
+    <w:rsid w:val="006C1562"/>
+    <w:rsid w:val="006C5F45"/>
+    <w:rsid w:val="006C7676"/>
+    <w:rsid w:val="006D41C2"/>
+    <w:rsid w:val="006D436B"/>
+    <w:rsid w:val="006E319B"/>
+    <w:rsid w:val="006E694D"/>
+    <w:rsid w:val="006E6964"/>
+    <w:rsid w:val="006F1E26"/>
+    <w:rsid w:val="006F5D44"/>
+    <w:rsid w:val="0070049F"/>
+    <w:rsid w:val="00704E66"/>
+    <w:rsid w:val="00707612"/>
+    <w:rsid w:val="00710922"/>
+    <w:rsid w:val="00710A74"/>
+    <w:rsid w:val="00717B1E"/>
+    <w:rsid w:val="00722010"/>
+    <w:rsid w:val="00722462"/>
+    <w:rsid w:val="00725B90"/>
+    <w:rsid w:val="007271EE"/>
+    <w:rsid w:val="00727592"/>
+    <w:rsid w:val="00727CF7"/>
+    <w:rsid w:val="00730235"/>
+    <w:rsid w:val="00732722"/>
+    <w:rsid w:val="00732E34"/>
+    <w:rsid w:val="007333A1"/>
+    <w:rsid w:val="00736602"/>
+    <w:rsid w:val="00741437"/>
+    <w:rsid w:val="00741610"/>
+    <w:rsid w:val="00741AF9"/>
+    <w:rsid w:val="00743A8F"/>
+    <w:rsid w:val="00746A00"/>
+    <w:rsid w:val="00747580"/>
+    <w:rsid w:val="00751858"/>
+    <w:rsid w:val="0075788B"/>
+    <w:rsid w:val="00757D7C"/>
+    <w:rsid w:val="007643FF"/>
+    <w:rsid w:val="00765EBE"/>
+    <w:rsid w:val="00771157"/>
+    <w:rsid w:val="007714D3"/>
+    <w:rsid w:val="00776526"/>
+    <w:rsid w:val="00785153"/>
+    <w:rsid w:val="007851B5"/>
+    <w:rsid w:val="0079050B"/>
+    <w:rsid w:val="007959FA"/>
+    <w:rsid w:val="007A5165"/>
+    <w:rsid w:val="007A548F"/>
+    <w:rsid w:val="007A5E6D"/>
+    <w:rsid w:val="007B039C"/>
+    <w:rsid w:val="007B090F"/>
+    <w:rsid w:val="007B3083"/>
+    <w:rsid w:val="007B4831"/>
+    <w:rsid w:val="007B569A"/>
+    <w:rsid w:val="007B7C17"/>
+    <w:rsid w:val="007C062F"/>
+    <w:rsid w:val="007C08F5"/>
+    <w:rsid w:val="007C424B"/>
+    <w:rsid w:val="007C54FA"/>
+    <w:rsid w:val="007C6DCF"/>
+    <w:rsid w:val="007D05E2"/>
+    <w:rsid w:val="007D3391"/>
+    <w:rsid w:val="007D55DF"/>
+    <w:rsid w:val="007D56D6"/>
+    <w:rsid w:val="007D5742"/>
+    <w:rsid w:val="007D748E"/>
+    <w:rsid w:val="007F1730"/>
+    <w:rsid w:val="007F4AF9"/>
+    <w:rsid w:val="007F5100"/>
+    <w:rsid w:val="007F51CF"/>
+    <w:rsid w:val="00802597"/>
+    <w:rsid w:val="00803187"/>
+    <w:rsid w:val="00807EAB"/>
+    <w:rsid w:val="00814E5C"/>
+    <w:rsid w:val="00817A6B"/>
+    <w:rsid w:val="00820D71"/>
+    <w:rsid w:val="008215E2"/>
+    <w:rsid w:val="00822207"/>
+    <w:rsid w:val="00823E84"/>
+    <w:rsid w:val="008246EE"/>
+    <w:rsid w:val="00830244"/>
+    <w:rsid w:val="00837DDD"/>
+    <w:rsid w:val="00844E81"/>
+    <w:rsid w:val="00852901"/>
+    <w:rsid w:val="00857222"/>
+    <w:rsid w:val="008647CB"/>
+    <w:rsid w:val="00867EEF"/>
+    <w:rsid w:val="00876EBC"/>
+    <w:rsid w:val="00881B54"/>
+    <w:rsid w:val="00884BFF"/>
+    <w:rsid w:val="00885F6C"/>
+    <w:rsid w:val="00886BC8"/>
+    <w:rsid w:val="00886FDE"/>
+    <w:rsid w:val="00887E3A"/>
+    <w:rsid w:val="00897432"/>
+    <w:rsid w:val="00897B7E"/>
+    <w:rsid w:val="008A073A"/>
+    <w:rsid w:val="008A4F3A"/>
+    <w:rsid w:val="008A4FB1"/>
+    <w:rsid w:val="008A7972"/>
+    <w:rsid w:val="008A7ADE"/>
+    <w:rsid w:val="008B1054"/>
+    <w:rsid w:val="008B41D3"/>
+    <w:rsid w:val="008C393D"/>
+    <w:rsid w:val="008C6671"/>
+    <w:rsid w:val="008C6952"/>
+    <w:rsid w:val="008D5568"/>
+    <w:rsid w:val="008D7C9A"/>
+    <w:rsid w:val="008E0230"/>
+    <w:rsid w:val="008E5754"/>
+    <w:rsid w:val="008E7674"/>
+    <w:rsid w:val="008E7FAA"/>
+    <w:rsid w:val="008F1134"/>
+    <w:rsid w:val="008F6752"/>
+    <w:rsid w:val="00902802"/>
+    <w:rsid w:val="009044DD"/>
+    <w:rsid w:val="00911A1E"/>
+    <w:rsid w:val="0091335A"/>
+    <w:rsid w:val="009134A1"/>
+    <w:rsid w:val="00926A6D"/>
+    <w:rsid w:val="009454C1"/>
+    <w:rsid w:val="0095113B"/>
+    <w:rsid w:val="0095769A"/>
+    <w:rsid w:val="00964ECC"/>
+    <w:rsid w:val="00965946"/>
+    <w:rsid w:val="00970571"/>
+    <w:rsid w:val="00971495"/>
+    <w:rsid w:val="009845F1"/>
+    <w:rsid w:val="0098532C"/>
+    <w:rsid w:val="00985A53"/>
+    <w:rsid w:val="00986FD3"/>
+    <w:rsid w:val="0099094D"/>
+    <w:rsid w:val="00997F34"/>
+    <w:rsid w:val="009A0285"/>
+    <w:rsid w:val="009A07F4"/>
+    <w:rsid w:val="009A25AD"/>
+    <w:rsid w:val="009A45E6"/>
+    <w:rsid w:val="009A76E3"/>
+    <w:rsid w:val="009B0FFA"/>
+    <w:rsid w:val="009B2B89"/>
+    <w:rsid w:val="009B2D32"/>
+    <w:rsid w:val="009B56F1"/>
+    <w:rsid w:val="009B5BAB"/>
+    <w:rsid w:val="009B5C17"/>
+    <w:rsid w:val="009C00AC"/>
+    <w:rsid w:val="009C0412"/>
+    <w:rsid w:val="009C0C26"/>
+    <w:rsid w:val="009C3415"/>
+    <w:rsid w:val="009C3A65"/>
+    <w:rsid w:val="009C6540"/>
+    <w:rsid w:val="009D58D7"/>
+    <w:rsid w:val="009D6EC5"/>
+    <w:rsid w:val="009E03F8"/>
+    <w:rsid w:val="009E5D7B"/>
+    <w:rsid w:val="009E62BB"/>
+    <w:rsid w:val="009E6ACD"/>
+    <w:rsid w:val="009F3177"/>
+    <w:rsid w:val="009F32E4"/>
+    <w:rsid w:val="009F3DF6"/>
+    <w:rsid w:val="009F639C"/>
+    <w:rsid w:val="00A036A8"/>
+    <w:rsid w:val="00A056FF"/>
+    <w:rsid w:val="00A05833"/>
+    <w:rsid w:val="00A062FE"/>
+    <w:rsid w:val="00A120A1"/>
+    <w:rsid w:val="00A20E98"/>
+    <w:rsid w:val="00A31D86"/>
+    <w:rsid w:val="00A31E34"/>
+    <w:rsid w:val="00A323B2"/>
+    <w:rsid w:val="00A3743D"/>
+    <w:rsid w:val="00A43884"/>
+    <w:rsid w:val="00A476C1"/>
+    <w:rsid w:val="00A52BD4"/>
+    <w:rsid w:val="00A57662"/>
+    <w:rsid w:val="00A60F83"/>
+    <w:rsid w:val="00A613A3"/>
+    <w:rsid w:val="00A6270A"/>
+    <w:rsid w:val="00A63751"/>
+    <w:rsid w:val="00A669C4"/>
+    <w:rsid w:val="00A71764"/>
+    <w:rsid w:val="00A7481E"/>
+    <w:rsid w:val="00A7710D"/>
+    <w:rsid w:val="00A824DC"/>
+    <w:rsid w:val="00A8486D"/>
+    <w:rsid w:val="00A862BE"/>
+    <w:rsid w:val="00A9454E"/>
+    <w:rsid w:val="00A9458C"/>
+    <w:rsid w:val="00A96276"/>
+    <w:rsid w:val="00A97FAD"/>
+    <w:rsid w:val="00AB034A"/>
+    <w:rsid w:val="00AB13B3"/>
+    <w:rsid w:val="00AB4579"/>
+    <w:rsid w:val="00AB5D78"/>
+    <w:rsid w:val="00AC2205"/>
+    <w:rsid w:val="00AC37BD"/>
+    <w:rsid w:val="00AD1E47"/>
+    <w:rsid w:val="00AD209A"/>
+    <w:rsid w:val="00AD3A4C"/>
+    <w:rsid w:val="00AD3ABA"/>
+    <w:rsid w:val="00AD3FC0"/>
+    <w:rsid w:val="00AD506F"/>
+    <w:rsid w:val="00AD70A5"/>
+    <w:rsid w:val="00AD7ECF"/>
+    <w:rsid w:val="00AD7F18"/>
+    <w:rsid w:val="00AE3C40"/>
+    <w:rsid w:val="00AE6F65"/>
+    <w:rsid w:val="00AF1332"/>
+    <w:rsid w:val="00AF1DA2"/>
+    <w:rsid w:val="00AF43C1"/>
+    <w:rsid w:val="00AF5210"/>
+    <w:rsid w:val="00B06676"/>
+    <w:rsid w:val="00B0706A"/>
+    <w:rsid w:val="00B12866"/>
+    <w:rsid w:val="00B210C8"/>
+    <w:rsid w:val="00B22C2F"/>
+    <w:rsid w:val="00B22E38"/>
+    <w:rsid w:val="00B3067F"/>
+    <w:rsid w:val="00B40BA3"/>
+    <w:rsid w:val="00B42519"/>
+    <w:rsid w:val="00B43F15"/>
+    <w:rsid w:val="00B453F6"/>
+    <w:rsid w:val="00B45E7C"/>
+    <w:rsid w:val="00B4710C"/>
+    <w:rsid w:val="00B47EAC"/>
+    <w:rsid w:val="00B53B5A"/>
+    <w:rsid w:val="00B61CEE"/>
+    <w:rsid w:val="00B63F37"/>
+    <w:rsid w:val="00B66811"/>
+    <w:rsid w:val="00B675BC"/>
+    <w:rsid w:val="00B75DD0"/>
+    <w:rsid w:val="00B764A4"/>
+    <w:rsid w:val="00B82F4C"/>
+    <w:rsid w:val="00B835F4"/>
+    <w:rsid w:val="00B838DD"/>
+    <w:rsid w:val="00B84419"/>
+    <w:rsid w:val="00B8545A"/>
+    <w:rsid w:val="00B91468"/>
+    <w:rsid w:val="00B925B1"/>
+    <w:rsid w:val="00B93695"/>
+    <w:rsid w:val="00B969A7"/>
+    <w:rsid w:val="00B9780B"/>
+    <w:rsid w:val="00BA144A"/>
+    <w:rsid w:val="00BA2AC8"/>
+    <w:rsid w:val="00BA61C0"/>
+    <w:rsid w:val="00BB3999"/>
+    <w:rsid w:val="00BB3C2E"/>
+    <w:rsid w:val="00BB4A56"/>
+    <w:rsid w:val="00BB7E3D"/>
+    <w:rsid w:val="00BB7E7B"/>
+    <w:rsid w:val="00BC4B94"/>
+    <w:rsid w:val="00BC6B1C"/>
+    <w:rsid w:val="00BC77A9"/>
+    <w:rsid w:val="00BD2B06"/>
+    <w:rsid w:val="00BD3115"/>
+    <w:rsid w:val="00BD5764"/>
+    <w:rsid w:val="00BD5A25"/>
+    <w:rsid w:val="00BE0822"/>
+    <w:rsid w:val="00BE4EA2"/>
+    <w:rsid w:val="00BF134F"/>
+    <w:rsid w:val="00BF30B7"/>
+    <w:rsid w:val="00BF4FF4"/>
+    <w:rsid w:val="00C01BA6"/>
+    <w:rsid w:val="00C01F4A"/>
+    <w:rsid w:val="00C02785"/>
+    <w:rsid w:val="00C02F76"/>
+    <w:rsid w:val="00C0418C"/>
+    <w:rsid w:val="00C04F21"/>
+    <w:rsid w:val="00C11ED3"/>
+    <w:rsid w:val="00C1334E"/>
+    <w:rsid w:val="00C27843"/>
+    <w:rsid w:val="00C37428"/>
+    <w:rsid w:val="00C376C5"/>
+    <w:rsid w:val="00C40697"/>
+    <w:rsid w:val="00C4175C"/>
+    <w:rsid w:val="00C46B37"/>
+    <w:rsid w:val="00C50A47"/>
+    <w:rsid w:val="00C62724"/>
+    <w:rsid w:val="00C731C5"/>
+    <w:rsid w:val="00C73B96"/>
+    <w:rsid w:val="00C75DBF"/>
+    <w:rsid w:val="00C81717"/>
+    <w:rsid w:val="00C842CE"/>
+    <w:rsid w:val="00C85014"/>
+    <w:rsid w:val="00C92787"/>
+    <w:rsid w:val="00C94B80"/>
+    <w:rsid w:val="00C971C8"/>
+    <w:rsid w:val="00CA22C7"/>
+    <w:rsid w:val="00CA2DA3"/>
+    <w:rsid w:val="00CB179A"/>
+    <w:rsid w:val="00CB1A42"/>
+    <w:rsid w:val="00CB423D"/>
+    <w:rsid w:val="00CB6241"/>
+    <w:rsid w:val="00CB6C67"/>
+    <w:rsid w:val="00CC0272"/>
+    <w:rsid w:val="00CC1517"/>
+    <w:rsid w:val="00CC2D3E"/>
+    <w:rsid w:val="00CC4BE5"/>
+    <w:rsid w:val="00CC77B0"/>
+    <w:rsid w:val="00CD0932"/>
+    <w:rsid w:val="00CD0E78"/>
+    <w:rsid w:val="00CD1A73"/>
+    <w:rsid w:val="00CD37A8"/>
+    <w:rsid w:val="00CD66E8"/>
+    <w:rsid w:val="00CE2DA9"/>
+    <w:rsid w:val="00CE5B26"/>
+    <w:rsid w:val="00CF37A2"/>
+    <w:rsid w:val="00CF5101"/>
+    <w:rsid w:val="00CF5B58"/>
+    <w:rsid w:val="00CF752A"/>
+    <w:rsid w:val="00D01F47"/>
+    <w:rsid w:val="00D02D4F"/>
+    <w:rsid w:val="00D0306B"/>
+    <w:rsid w:val="00D051AB"/>
+    <w:rsid w:val="00D073C6"/>
+    <w:rsid w:val="00D10B07"/>
+    <w:rsid w:val="00D1392E"/>
+    <w:rsid w:val="00D21CB4"/>
+    <w:rsid w:val="00D27640"/>
+    <w:rsid w:val="00D30D00"/>
+    <w:rsid w:val="00D31FB1"/>
+    <w:rsid w:val="00D3592D"/>
+    <w:rsid w:val="00D45015"/>
+    <w:rsid w:val="00D51C92"/>
+    <w:rsid w:val="00D54BA1"/>
+    <w:rsid w:val="00D613F0"/>
+    <w:rsid w:val="00D66B10"/>
+    <w:rsid w:val="00D66DE5"/>
+    <w:rsid w:val="00D70014"/>
+    <w:rsid w:val="00D7216A"/>
+    <w:rsid w:val="00D754B6"/>
+    <w:rsid w:val="00D82B24"/>
+    <w:rsid w:val="00D83DA4"/>
+    <w:rsid w:val="00D846F2"/>
+    <w:rsid w:val="00D865B1"/>
+    <w:rsid w:val="00D87BEE"/>
+    <w:rsid w:val="00D93A3D"/>
+    <w:rsid w:val="00D93E43"/>
+    <w:rsid w:val="00D96362"/>
+    <w:rsid w:val="00D96945"/>
+    <w:rsid w:val="00D9730F"/>
+    <w:rsid w:val="00D9790B"/>
+    <w:rsid w:val="00DA0E4D"/>
+    <w:rsid w:val="00DA3373"/>
+    <w:rsid w:val="00DA53B8"/>
+    <w:rsid w:val="00DA5ADB"/>
+    <w:rsid w:val="00DA6127"/>
+    <w:rsid w:val="00DB02B0"/>
+    <w:rsid w:val="00DC0299"/>
+    <w:rsid w:val="00DC0A8D"/>
+    <w:rsid w:val="00DC16FE"/>
+    <w:rsid w:val="00DC1B30"/>
+    <w:rsid w:val="00DC3C9E"/>
+    <w:rsid w:val="00DC437A"/>
+    <w:rsid w:val="00DC4E63"/>
+    <w:rsid w:val="00DC4EA4"/>
+    <w:rsid w:val="00DC6626"/>
+    <w:rsid w:val="00DD64D3"/>
+    <w:rsid w:val="00DD6EFD"/>
+    <w:rsid w:val="00DE0D46"/>
+    <w:rsid w:val="00DE14B8"/>
+    <w:rsid w:val="00DE4A6E"/>
+    <w:rsid w:val="00DE6D38"/>
+    <w:rsid w:val="00DF55E1"/>
+    <w:rsid w:val="00DF614D"/>
+    <w:rsid w:val="00E108E9"/>
+    <w:rsid w:val="00E12330"/>
+    <w:rsid w:val="00E163BF"/>
+    <w:rsid w:val="00E20E7F"/>
+    <w:rsid w:val="00E23B2F"/>
+    <w:rsid w:val="00E2622E"/>
+    <w:rsid w:val="00E278FC"/>
+    <w:rsid w:val="00E31B0B"/>
+    <w:rsid w:val="00E35863"/>
+    <w:rsid w:val="00E36660"/>
+    <w:rsid w:val="00E36AF5"/>
+    <w:rsid w:val="00E36EBF"/>
+    <w:rsid w:val="00E3794E"/>
+    <w:rsid w:val="00E417D9"/>
+    <w:rsid w:val="00E433B3"/>
+    <w:rsid w:val="00E45049"/>
+    <w:rsid w:val="00E46442"/>
+    <w:rsid w:val="00E501A8"/>
+    <w:rsid w:val="00E6306C"/>
+    <w:rsid w:val="00E65C14"/>
+    <w:rsid w:val="00E67E81"/>
+    <w:rsid w:val="00E7009B"/>
+    <w:rsid w:val="00E71A6D"/>
+    <w:rsid w:val="00E71E53"/>
+    <w:rsid w:val="00E741AC"/>
+    <w:rsid w:val="00E843FC"/>
+    <w:rsid w:val="00E856FE"/>
+    <w:rsid w:val="00E9025F"/>
+    <w:rsid w:val="00E97B0D"/>
+    <w:rsid w:val="00EA37B0"/>
+    <w:rsid w:val="00EA5A9C"/>
+    <w:rsid w:val="00EB17F2"/>
+    <w:rsid w:val="00EB1FFC"/>
+    <w:rsid w:val="00EB33D1"/>
+    <w:rsid w:val="00ED1A2B"/>
+    <w:rsid w:val="00ED2790"/>
+    <w:rsid w:val="00ED6CCE"/>
+    <w:rsid w:val="00EE76AF"/>
+    <w:rsid w:val="00EF2B15"/>
+    <w:rsid w:val="00EF328B"/>
+    <w:rsid w:val="00EF49B9"/>
+    <w:rsid w:val="00EF5E9B"/>
+    <w:rsid w:val="00EF7BCC"/>
+    <w:rsid w:val="00F026C1"/>
+    <w:rsid w:val="00F071EF"/>
+    <w:rsid w:val="00F07207"/>
+    <w:rsid w:val="00F21C1D"/>
+    <w:rsid w:val="00F22B4E"/>
+    <w:rsid w:val="00F22E05"/>
+    <w:rsid w:val="00F25E14"/>
+    <w:rsid w:val="00F303D1"/>
+    <w:rsid w:val="00F30A24"/>
+    <w:rsid w:val="00F311DB"/>
+    <w:rsid w:val="00F35DB4"/>
+    <w:rsid w:val="00F40C1B"/>
+    <w:rsid w:val="00F42A41"/>
+    <w:rsid w:val="00F42C03"/>
+    <w:rsid w:val="00F468D6"/>
+    <w:rsid w:val="00F46D87"/>
+    <w:rsid w:val="00F47C8E"/>
+    <w:rsid w:val="00F50E8D"/>
+    <w:rsid w:val="00F50FC4"/>
+    <w:rsid w:val="00F5402B"/>
+    <w:rsid w:val="00F5446E"/>
+    <w:rsid w:val="00F57DEB"/>
+    <w:rsid w:val="00F624F4"/>
+    <w:rsid w:val="00F62CC3"/>
+    <w:rsid w:val="00F62EA8"/>
+    <w:rsid w:val="00F65A75"/>
+    <w:rsid w:val="00F66E26"/>
+    <w:rsid w:val="00F727DB"/>
+    <w:rsid w:val="00F73635"/>
+    <w:rsid w:val="00F8027D"/>
+    <w:rsid w:val="00F86621"/>
+    <w:rsid w:val="00F86701"/>
+    <w:rsid w:val="00F93438"/>
+    <w:rsid w:val="00F94513"/>
+    <w:rsid w:val="00FA1AEE"/>
+    <w:rsid w:val="00FB0195"/>
+    <w:rsid w:val="00FB0382"/>
+    <w:rsid w:val="00FB05CE"/>
+    <w:rsid w:val="00FB1B40"/>
+    <w:rsid w:val="00FB54D3"/>
+    <w:rsid w:val="00FB5B15"/>
+    <w:rsid w:val="00FC2D82"/>
+    <w:rsid w:val="00FC4B03"/>
+    <w:rsid w:val="00FC6A4E"/>
+    <w:rsid w:val="00FD6DAE"/>
+    <w:rsid w:val="00FE2CF1"/>
+    <w:rsid w:val="00FE3CB8"/>
+    <w:rsid w:val="00FF0B85"/>
+    <w:rsid w:val="00FF2159"/>
+    <w:rsid w:val="078C31C9"/>
+    <w:rsid w:val="092EBA9C"/>
+    <w:rsid w:val="0B644A56"/>
+    <w:rsid w:val="1282DA77"/>
+    <w:rsid w:val="15152F30"/>
+    <w:rsid w:val="17B2AFCC"/>
+    <w:rsid w:val="26A00457"/>
+    <w:rsid w:val="65EE4D1A"/>
+    <w:rsid w:val="740CAD6E"/>
+  </w:rsids>
+  <m:mathPr>
+    <m:mathFont m:val="Cambria Math"/>
+    <m:brkBin m:val="before"/>
+    <m:brkBinSub m:val="--"/>
+    <m:smallFrac/>
+    <m:dispDef/>
+    <m:lMargin m:val="0"/>
+    <m:rMargin m:val="0"/>
+    <m:defJc m:val="centerGroup"/>
+    <m:wrapIndent m:val="1440"/>
+    <m:intLim m:val="subSup"/>
+    <m:naryLim m:val="undOvr"/>
+  </m:mathPr>
+  <w:themeFontLang w:val="pt-BR"/>
+  <w:clrSchemeMapping w:bg1="light1" w:t1="dark1" w:bg2="light2" w:t2="dark2" w:accent1="accent1" w:accent2="accent2" w:accent3="accent3" w:accent4="accent4" w:accent5="accent5" w:accent6="accent6" w:hyperlink="hyperlink" w:followedHyperlink="followedHyperlink"/>
+  <w:doNotIncludeSubdocsInStats/>
+  <w:shapeDefaults>
+    <o:shapedefaults v:ext="edit" spidmax="1026" fillcolor="white" stroke="f">
+      <v:fill color="white"/>
+      <v:stroke on="f"/>
+      <v:shadow color="#868686"/>
+    </o:shapedefaults>
+    <o:shapelayout v:ext="edit">
+      <o:idmap v:ext="edit" data="1"/>
+    </o:shapelayout>
+  </w:shapeDefaults>
+  <w:decimalSymbol w:val=","/>
+  <w:listSeparator w:val=";"/>
+  <w14:docId w14:val="0B644A56"/>
+  <w15:chartTrackingRefBased/>
+  <w15:docId w15:val="{EEA4DE7C-8755-4FD2-9C53-0A5E06487691}"/>
+</w:settings>
+</file>
+
+<file path=word\styles.xml><?xml version="1.0" encoding="utf-8"?>
 <w:styles xmlns:mc="http://schemas.openxmlformats.org/markup-compatibility/2006" xmlns:r="http://schemas.openxmlformats.org/officeDocument/2006/relationships" xmlns:w="http://schemas.openxmlformats.org/wordprocessingml/2006/main" xmlns:w14="http://schemas.microsoft.com/office/word/2010/wordml" xmlns:w15="http://schemas.microsoft.com/office/word/2012/wordml" xmlns:w16cex="http://schemas.microsoft.com/office/word/2018/wordml/cex" xmlns:w16cid="http://schemas.microsoft.com/office/word/2016/wordml/cid" xmlns:w16="http://schemas.microsoft.com/office/word/2018/wordml" xmlns:w16du="http://schemas.microsoft.com/office/word/2023/wordml/word16du" xmlns:w16sdtdh="http://schemas.microsoft.com/office/word/2020/wordml/sdtdatahash" xmlns:w16sdtfl="http://schemas.microsoft.com/office/word/2024/wordml/sdtformatlock" xmlns:w16se="http://schemas.microsoft.com/office/word/2015/wordml/symex" mc:Ignorable="w14 w15 w16se w16cid w16 w16cex w16sdtdh w16sdtfl w16du">
   <w:docDefaults>
     <w:rPrDefault>
@@ -8167,7 +9196,7 @@
 </w:styles>
 </file>
 
-<file path=word/theme/theme1.xml><?xml version="1.0" encoding="utf-8"?>
+<file path=word\theme\theme1.xml><?xml version="1.0" encoding="utf-8"?>
 <a:theme xmlns:a="http://schemas.openxmlformats.org/drawingml/2006/main" name="Tema do Office">
   <a:themeElements>
     <a:clrScheme name="Office">
@@ -8428,7 +9457,30 @@
 </a:theme>
 </file>
 
-<file path=word/webextensions/taskpanes.xml><?xml version="1.0" encoding="utf-8"?>
+<file path=word\webSettings.xml><?xml version="1.0" encoding="utf-8"?>
+<w:webSettings xmlns:mc="http://schemas.openxmlformats.org/markup-compatibility/2006" xmlns:r="http://schemas.openxmlformats.org/officeDocument/2006/relationships" xmlns:w="http://schemas.openxmlformats.org/wordprocessingml/2006/main" xmlns:w14="http://schemas.microsoft.com/office/word/2010/wordml" xmlns:w15="http://schemas.microsoft.com/office/word/2012/wordml" xmlns:w16cex="http://schemas.microsoft.com/office/word/2018/wordml/cex" xmlns:w16cid="http://schemas.microsoft.com/office/word/2016/wordml/cid" xmlns:w16="http://schemas.microsoft.com/office/word/2018/wordml" xmlns:w16du="http://schemas.microsoft.com/office/word/2023/wordml/word16du" xmlns:w16sdtdh="http://schemas.microsoft.com/office/word/2020/wordml/sdtdatahash" xmlns:w16sdtfl="http://schemas.microsoft.com/office/word/2024/wordml/sdtformatlock" xmlns:w16se="http://schemas.microsoft.com/office/word/2015/wordml/symex" mc:Ignorable="w14 w15 w16se w16cid w16 w16cex w16sdtdh w16sdtfl w16du">
+  <w:divs>
+    <w:div w:id="399447810">
+      <w:bodyDiv w:val="1"/>
+      <w:marLeft w:val="0"/>
+      <w:marRight w:val="0"/>
+      <w:marTop w:val="0"/>
+      <w:marBottom w:val="0"/>
+      <w:divBdr>
+        <w:top w:val="none" w:sz="0" w:space="0" w:color="auto"/>
+        <w:left w:val="none" w:sz="0" w:space="0" w:color="auto"/>
+        <w:bottom w:val="none" w:sz="0" w:space="0" w:color="auto"/>
+        <w:right w:val="none" w:sz="0" w:space="0" w:color="auto"/>
+      </w:divBdr>
+    </w:div>
+  </w:divs>
+  <w:optimizeForBrowser/>
+  <w:relyOnVML/>
+  <w:allowPNG/>
+</w:webSettings>
+</file>
+
+<file path=word\webextensions\taskpanes.xml><?xml version="1.0" encoding="utf-8"?>
 <wetp:taskpanes xmlns:wetp="http://schemas.microsoft.com/office/webextensions/taskpanes/2010/11">
   <wetp:taskpane dockstate="right" visibility="0" width="350" row="2">
     <wetp:webextensionref xmlns:r="http://schemas.openxmlformats.org/officeDocument/2006/relationships" r:id="rId1"/>
@@ -8436,7 +9488,7 @@
 </wetp:taskpanes>
 </file>
 
-<file path=word/webextensions/webextension1.xml><?xml version="1.0" encoding="utf-8"?>
+<file path=word\webextensions\webextension1.xml><?xml version="1.0" encoding="utf-8"?>
 <we:webextension xmlns:we="http://schemas.microsoft.com/office/webextensions/webextension/2010/11" id="{0E22F6B3-63C6-4C00-BA2F-EAD7FF03F1F2}">
   <we:reference id="wa200010725" version="1.0.0.1" store="pt-BR" storeType="OMEX"/>
   <we:alternateReferences>
@@ -8448,16 +9500,4 @@
   <we:bindings/>
   <we:snapshot xmlns:r="http://schemas.openxmlformats.org/officeDocument/2006/relationships"/>
 </we:webextension>
-</file>
-
-<file path=customXml/item1.xml><?xml version="1.0" encoding="utf-8"?>
-<b:Sources xmlns:b="http://schemas.openxmlformats.org/officeDocument/2006/bibliography" xmlns="http://schemas.openxmlformats.org/officeDocument/2006/bibliography" SelectedStyle="\APASixthEditionOfficeOnline.xsl" StyleName="APA" Version="6"/>
-</file>
-
-<file path=customXml/itemProps1.xml><?xml version="1.0" encoding="utf-8"?>
-<ds:datastoreItem xmlns:ds="http://schemas.openxmlformats.org/officeDocument/2006/customXml" ds:itemID="{77CAD40A-37C4-45EB-863E-17792EDB9BB0}">
-  <ds:schemaRefs>
-    <ds:schemaRef ds:uri="http://schemas.openxmlformats.org/officeDocument/2006/bibliography"/>
-  </ds:schemaRefs>
-</ds:datastoreItem>
 </file>
</xml_diff>

<commit_message>
fix: adiciona {celularAluno} e {emailAluno} no template sem quebrar variaveis existentes
</commit_message>
<xml_diff>
--- a/lib/templates/contrato_template.docx
+++ b/lib/templates/contrato_template.docx
@@ -1,75 +1,5 @@
 
-<file path=customXml\item1.xml><?xml version="1.0" encoding="utf-8"?>
-<b:Sources xmlns:b="http://schemas.openxmlformats.org/officeDocument/2006/bibliography" xmlns="http://schemas.openxmlformats.org/officeDocument/2006/bibliography" SelectedStyle="\APASixthEditionOfficeOnline.xsl" StyleName="APA" Version="6"/>
-</file>
-
-<file path=customXml\itemProps1.xml><?xml version="1.0" encoding="utf-8"?>
-<ds:datastoreItem xmlns:ds="http://schemas.openxmlformats.org/officeDocument/2006/customXml" ds:itemID="{77CAD40A-37C4-45EB-863E-17792EDB9BB0}">
-  <ds:schemaRefs>
-    <ds:schemaRef ds:uri="http://schemas.openxmlformats.org/officeDocument/2006/bibliography"/>
-  </ds:schemaRefs>
-</ds:datastoreItem>
-</file>
-
-<file path=docProps\app.xml><?xml version="1.0" encoding="utf-8"?>
-<Properties xmlns="http://schemas.openxmlformats.org/officeDocument/2006/extended-properties" xmlns:vt="http://schemas.openxmlformats.org/officeDocument/2006/docPropsVTypes">
-  <Template>Normal</Template>
-  <TotalTime>62</TotalTime>
-  <Pages>6</Pages>
-  <Words>2957</Words>
-  <Characters>15974</Characters>
-  <Application>Microsoft Office Word</Application>
-  <DocSecurity>0</DocSecurity>
-  <Lines>133</Lines>
-  <Paragraphs>37</Paragraphs>
-  <ScaleCrop>false</ScaleCrop>
-  <HeadingPairs>
-    <vt:vector size="4" baseType="variant">
-      <vt:variant>
-        <vt:lpstr>Título</vt:lpstr>
-      </vt:variant>
-      <vt:variant>
-        <vt:i4>1</vt:i4>
-      </vt:variant>
-      <vt:variant>
-        <vt:lpstr>Title</vt:lpstr>
-      </vt:variant>
-      <vt:variant>
-        <vt:i4>1</vt:i4>
-      </vt:variant>
-    </vt:vector>
-  </HeadingPairs>
-  <TitlesOfParts>
-    <vt:vector size="2" baseType="lpstr">
-      <vt:lpstr>Contrato de prestqação de serviços educacionaisque firmam entre si as partes abaixos  identificadas como CONTRATADA empresa de treinamento profissional FERNANDO ANTONIO MARTINS DE OLIVEIRA – ME, com nome fantasia PET CURSOS e inscrita no CNPJ sob  nº</vt:lpstr>
-      <vt:lpstr>Contrato de prestqação de serviços educacionaisque firmam entre si as partes abaixos  identificadas como CONTRATADA empresa de treinamento profissional FERNANDO ANTONIO MARTINS DE OLIVEIRA – ME, com nome fantasia PET CURSOS e inscrita no CNPJ sob  nº</vt:lpstr>
-    </vt:vector>
-  </TitlesOfParts>
-  <Company>House</Company>
-  <LinksUpToDate>false</LinksUpToDate>
-  <CharactersWithSpaces>18894</CharactersWithSpaces>
-  <SharedDoc>false</SharedDoc>
-  <HyperlinksChanged>false</HyperlinksChanged>
-  <AppVersion>16.0000</AppVersion>
-</Properties>
-</file>
-
-<file path=docProps\core.xml><?xml version="1.0" encoding="utf-8"?>
-<cp:coreProperties xmlns:cp="http://schemas.openxmlformats.org/package/2006/metadata/core-properties" xmlns:dc="http://purl.org/dc/elements/1.1/" xmlns:dcterms="http://purl.org/dc/terms/" xmlns:dcmitype="http://purl.org/dc/dcmitype/" xmlns:xsi="http://www.w3.org/2001/XMLSchema-instance">
-  <dc:title>Contrato de prestqação de serviços educacionaisque firmam entre si as partes abaixos  identificadas como CONTRATADA empresa de treinamento profissional FERNANDO ANTONIO MARTINS DE OLIVEIRA – ME, com nome fantasia PET CURSOS e inscrita no CNPJ sob  nº</dc:title>
-  <dc:subject/>
-  <dc:creator>Financeiro Jumper</dc:creator>
-  <cp:keywords/>
-  <dc:description/>
-  <cp:lastModifiedBy>Paola Rafaela</cp:lastModifiedBy>
-  <cp:revision>3</cp:revision>
-  <cp:lastPrinted>2026-05-15T19:34:00Z</cp:lastPrinted>
-  <dcterms:created xsi:type="dcterms:W3CDTF">2026-05-15T21:02:00Z</dcterms:created>
-  <dcterms:modified xsi:type="dcterms:W3CDTF">2026-05-15T21:04:00Z</dcterms:modified>
-</cp:coreProperties>
-</file>
-
-<file path=word\document.xml><?xml version="1.0" encoding="utf-8"?>
+<file path=word/document.xml><?xml version="1.0" encoding="utf-8"?>
 <w:document xmlns:wpc="http://schemas.microsoft.com/office/word/2010/wordprocessingCanvas" xmlns:cx="http://schemas.microsoft.com/office/drawing/2014/chartex" xmlns:cx1="http://schemas.microsoft.com/office/drawing/2015/9/8/chartex" xmlns:cx2="http://schemas.microsoft.com/office/drawing/2015/10/21/chartex" xmlns:cx3="http://schemas.microsoft.com/office/drawing/2016/5/9/chartex" xmlns:cx4="http://schemas.microsoft.com/office/drawing/2016/5/10/chartex" xmlns:cx5="http://schemas.microsoft.com/office/drawing/2016/5/11/chartex" xmlns:cx6="http://schemas.microsoft.com/office/drawing/2016/5/12/chartex" xmlns:cx7="http://schemas.microsoft.com/office/drawing/2016/5/13/chartex" xmlns:cx8="http://schemas.microsoft.com/office/drawing/2016/5/14/chartex" xmlns:mc="http://schemas.openxmlformats.org/markup-compatibility/2006" xmlns:aink="http://schemas.microsoft.com/office/drawing/2016/ink" xmlns:am3d="http://schemas.microsoft.com/office/drawing/2017/model3d" xmlns:o="urn:schemas-microsoft-com:office:office" xmlns:oel="http://schemas.microsoft.com/office/2019/extlst" xmlns:r="http://schemas.openxmlformats.org/officeDocument/2006/relationships" xmlns:m="http://schemas.openxmlformats.org/officeDocument/2006/math" xmlns:v="urn:schemas-microsoft-com:vml" xmlns:wp14="http://schemas.microsoft.com/office/word/2010/wordprocessingDrawing" xmlns:wp="http://schemas.openxmlformats.org/drawingml/2006/wordprocessingDrawing" xmlns:w10="urn:schemas-microsoft-com:office:word" xmlns:w="http://schemas.openxmlformats.org/wordprocessingml/2006/main" xmlns:w14="http://schemas.microsoft.com/office/word/2010/wordml" xmlns:w15="http://schemas.microsoft.com/office/word/2012/wordml" xmlns:w16cex="http://schemas.microsoft.com/office/word/2018/wordml/cex" xmlns:w16cid="http://schemas.microsoft.com/office/word/2016/wordml/cid" xmlns:w16="http://schemas.microsoft.com/office/word/2018/wordml" xmlns:w16du="http://schemas.microsoft.com/office/word/2023/wordml/word16du" xmlns:w16sdtdh="http://schemas.microsoft.com/office/word/2020/wordml/sdtdatahash" xmlns:w16sdtfl="http://schemas.microsoft.com/office/word/2024/wordml/sdtformatlock" xmlns:w16se="http://schemas.microsoft.com/office/word/2015/wordml/symex" xmlns:wpg="http://schemas.microsoft.com/office/word/2010/wordprocessingGroup" xmlns:wpi="http://schemas.microsoft.com/office/word/2010/wordprocessingInk" xmlns:wne="http://schemas.microsoft.com/office/word/2006/wordml" xmlns:wps="http://schemas.microsoft.com/office/word/2010/wordprocessingShape" mc:Ignorable="w14 w15 w16se w16cid w16 w16cex w16sdtdh w16sdtfl w16du wp14">
   <w:body>
     <w:p>
@@ -5624,7 +5554,7 @@
 </w:document>
 </file>
 
-<file path=word\endnotes.xml><?xml version="1.0" encoding="utf-8"?>
+<file path=word/endnotes.xml><?xml version="1.0" encoding="utf-8"?>
 <w:endnotes xmlns:wpc="http://schemas.microsoft.com/office/word/2010/wordprocessingCanvas" xmlns:cx="http://schemas.microsoft.com/office/drawing/2014/chartex" xmlns:cx1="http://schemas.microsoft.com/office/drawing/2015/9/8/chartex" xmlns:cx2="http://schemas.microsoft.com/office/drawing/2015/10/21/chartex" xmlns:cx3="http://schemas.microsoft.com/office/drawing/2016/5/9/chartex" xmlns:cx4="http://schemas.microsoft.com/office/drawing/2016/5/10/chartex" xmlns:cx5="http://schemas.microsoft.com/office/drawing/2016/5/11/chartex" xmlns:cx6="http://schemas.microsoft.com/office/drawing/2016/5/12/chartex" xmlns:cx7="http://schemas.microsoft.com/office/drawing/2016/5/13/chartex" xmlns:cx8="http://schemas.microsoft.com/office/drawing/2016/5/14/chartex" xmlns:mc="http://schemas.openxmlformats.org/markup-compatibility/2006" xmlns:aink="http://schemas.microsoft.com/office/drawing/2016/ink" xmlns:am3d="http://schemas.microsoft.com/office/drawing/2017/model3d" xmlns:o="urn:schemas-microsoft-com:office:office" xmlns:oel="http://schemas.microsoft.com/office/2019/extlst" xmlns:r="http://schemas.openxmlformats.org/officeDocument/2006/relationships" xmlns:m="http://schemas.openxmlformats.org/officeDocument/2006/math" xmlns:v="urn:schemas-microsoft-com:vml" xmlns:wp14="http://schemas.microsoft.com/office/word/2010/wordprocessingDrawing" xmlns:wp="http://schemas.openxmlformats.org/drawingml/2006/wordprocessingDrawing" xmlns:w10="urn:schemas-microsoft-com:office:word" xmlns:w="http://schemas.openxmlformats.org/wordprocessingml/2006/main" xmlns:w14="http://schemas.microsoft.com/office/word/2010/wordml" xmlns:w15="http://schemas.microsoft.com/office/word/2012/wordml" xmlns:w16cex="http://schemas.microsoft.com/office/word/2018/wordml/cex" xmlns:w16cid="http://schemas.microsoft.com/office/word/2016/wordml/cid" xmlns:w16="http://schemas.microsoft.com/office/word/2018/wordml" xmlns:w16du="http://schemas.microsoft.com/office/word/2023/wordml/word16du" xmlns:w16sdtdh="http://schemas.microsoft.com/office/word/2020/wordml/sdtdatahash" xmlns:w16sdtfl="http://schemas.microsoft.com/office/word/2024/wordml/sdtformatlock" xmlns:w16se="http://schemas.microsoft.com/office/word/2015/wordml/symex" xmlns:wpg="http://schemas.microsoft.com/office/word/2010/wordprocessingGroup" xmlns:wpi="http://schemas.microsoft.com/office/word/2010/wordprocessingInk" xmlns:wne="http://schemas.microsoft.com/office/word/2006/wordml" xmlns:wps="http://schemas.microsoft.com/office/word/2010/wordprocessingShape" mc:Ignorable="w14 w15 w16se w16cid w16 w16cex w16sdtdh w16sdtfl w16du wp14">
   <w:endnote w:type="separator" w:id="-1">
     <w:p>
@@ -5643,47 +5573,7 @@
 </w:endnotes>
 </file>
 
-<file path=word\fontTable.xml><?xml version="1.0" encoding="utf-8"?>
-<w:fonts xmlns:mc="http://schemas.openxmlformats.org/markup-compatibility/2006" xmlns:r="http://schemas.openxmlformats.org/officeDocument/2006/relationships" xmlns:w="http://schemas.openxmlformats.org/wordprocessingml/2006/main" xmlns:w14="http://schemas.microsoft.com/office/word/2010/wordml" xmlns:w15="http://schemas.microsoft.com/office/word/2012/wordml" xmlns:w16cex="http://schemas.microsoft.com/office/word/2018/wordml/cex" xmlns:w16cid="http://schemas.microsoft.com/office/word/2016/wordml/cid" xmlns:w16="http://schemas.microsoft.com/office/word/2018/wordml" xmlns:w16du="http://schemas.microsoft.com/office/word/2023/wordml/word16du" xmlns:w16sdtdh="http://schemas.microsoft.com/office/word/2020/wordml/sdtdatahash" xmlns:w16sdtfl="http://schemas.microsoft.com/office/word/2024/wordml/sdtformatlock" xmlns:w16se="http://schemas.microsoft.com/office/word/2015/wordml/symex" mc:Ignorable="w14 w15 w16se w16cid w16 w16cex w16sdtdh w16sdtfl w16du">
-  <w:font w:name="Times New Roman">
-    <w:panose1 w:val="02020603050405020304"/>
-    <w:charset w:val="00"/>
-    <w:family w:val="roman"/>
-    <w:pitch w:val="variable"/>
-    <w:sig w:usb0="E0002EFF" w:usb1="C000785B" w:usb2="00000009" w:usb3="00000000" w:csb0="000001FF" w:csb1="00000000"/>
-  </w:font>
-  <w:font w:name="Tahoma">
-    <w:panose1 w:val="020B0604030504040204"/>
-    <w:charset w:val="00"/>
-    <w:family w:val="swiss"/>
-    <w:pitch w:val="variable"/>
-    <w:sig w:usb0="E1002EFF" w:usb1="C000605B" w:usb2="00000029" w:usb3="00000000" w:csb0="000101FF" w:csb1="00000000"/>
-  </w:font>
-  <w:font w:name="Arial">
-    <w:panose1 w:val="020B0604020202020204"/>
-    <w:charset w:val="00"/>
-    <w:family w:val="swiss"/>
-    <w:pitch w:val="variable"/>
-    <w:sig w:usb0="E0002EFF" w:usb1="C000785B" w:usb2="00000009" w:usb3="00000000" w:csb0="000001FF" w:csb1="00000000"/>
-  </w:font>
-  <w:font w:name="Calibri Light">
-    <w:panose1 w:val="020F0302020204030204"/>
-    <w:charset w:val="00"/>
-    <w:family w:val="swiss"/>
-    <w:pitch w:val="variable"/>
-    <w:sig w:usb0="E4002EFF" w:usb1="C000247B" w:usb2="00000009" w:usb3="00000000" w:csb0="000001FF" w:csb1="00000000"/>
-  </w:font>
-  <w:font w:name="Calibri">
-    <w:panose1 w:val="020F0502020204030204"/>
-    <w:charset w:val="00"/>
-    <w:family w:val="swiss"/>
-    <w:pitch w:val="variable"/>
-    <w:sig w:usb0="E4002EFF" w:usb1="C000247B" w:usb2="00000009" w:usb3="00000000" w:csb0="000001FF" w:csb1="00000000"/>
-  </w:font>
-</w:fonts>
-</file>
-
-<file path=word\footer1.xml><?xml version="1.0" encoding="utf-8"?>
+<file path=word/footer1.xml><?xml version="1.0" encoding="utf-8"?>
 <w:ftr xmlns:wpc="http://schemas.microsoft.com/office/word/2010/wordprocessingCanvas" xmlns:cx="http://schemas.microsoft.com/office/drawing/2014/chartex" xmlns:cx1="http://schemas.microsoft.com/office/drawing/2015/9/8/chartex" xmlns:cx2="http://schemas.microsoft.com/office/drawing/2015/10/21/chartex" xmlns:cx3="http://schemas.microsoft.com/office/drawing/2016/5/9/chartex" xmlns:cx4="http://schemas.microsoft.com/office/drawing/2016/5/10/chartex" xmlns:cx5="http://schemas.microsoft.com/office/drawing/2016/5/11/chartex" xmlns:cx6="http://schemas.microsoft.com/office/drawing/2016/5/12/chartex" xmlns:cx7="http://schemas.microsoft.com/office/drawing/2016/5/13/chartex" xmlns:cx8="http://schemas.microsoft.com/office/drawing/2016/5/14/chartex" xmlns:mc="http://schemas.openxmlformats.org/markup-compatibility/2006" xmlns:aink="http://schemas.microsoft.com/office/drawing/2016/ink" xmlns:am3d="http://schemas.microsoft.com/office/drawing/2017/model3d" xmlns:o="urn:schemas-microsoft-com:office:office" xmlns:oel="http://schemas.microsoft.com/office/2019/extlst" xmlns:r="http://schemas.openxmlformats.org/officeDocument/2006/relationships" xmlns:m="http://schemas.openxmlformats.org/officeDocument/2006/math" xmlns:v="urn:schemas-microsoft-com:vml" xmlns:wp14="http://schemas.microsoft.com/office/word/2010/wordprocessingDrawing" xmlns:wp="http://schemas.openxmlformats.org/drawingml/2006/wordprocessingDrawing" xmlns:w10="urn:schemas-microsoft-com:office:word" xmlns:w="http://schemas.openxmlformats.org/wordprocessingml/2006/main" xmlns:w14="http://schemas.microsoft.com/office/word/2010/wordml" xmlns:w15="http://schemas.microsoft.com/office/word/2012/wordml" xmlns:w16cex="http://schemas.microsoft.com/office/word/2018/wordml/cex" xmlns:w16cid="http://schemas.microsoft.com/office/word/2016/wordml/cid" xmlns:w16="http://schemas.microsoft.com/office/word/2018/wordml" xmlns:w16du="http://schemas.microsoft.com/office/word/2023/wordml/word16du" xmlns:w16sdtdh="http://schemas.microsoft.com/office/word/2020/wordml/sdtdatahash" xmlns:w16sdtfl="http://schemas.microsoft.com/office/word/2024/wordml/sdtformatlock" xmlns:w16se="http://schemas.microsoft.com/office/word/2015/wordml/symex" xmlns:wpg="http://schemas.microsoft.com/office/word/2010/wordprocessingGroup" xmlns:wpi="http://schemas.microsoft.com/office/word/2010/wordprocessingInk" xmlns:wne="http://schemas.microsoft.com/office/word/2006/wordml" xmlns:wps="http://schemas.microsoft.com/office/word/2010/wordprocessingShape" mc:Ignorable="w14 w15 w16se w16cid w16 w16cex w16sdtdh w16sdtfl w16du wp14">
   <w:p>
     <w:pPr>
@@ -5721,7 +5611,7 @@
 </w:ftr>
 </file>
 
-<file path=word\footer2.xml><?xml version="1.0" encoding="utf-8"?>
+<file path=word/footer2.xml><?xml version="1.0" encoding="utf-8"?>
 <w:ftr xmlns:wpc="http://schemas.microsoft.com/office/word/2010/wordprocessingCanvas" xmlns:cx="http://schemas.microsoft.com/office/drawing/2014/chartex" xmlns:cx1="http://schemas.microsoft.com/office/drawing/2015/9/8/chartex" xmlns:cx2="http://schemas.microsoft.com/office/drawing/2015/10/21/chartex" xmlns:cx3="http://schemas.microsoft.com/office/drawing/2016/5/9/chartex" xmlns:cx4="http://schemas.microsoft.com/office/drawing/2016/5/10/chartex" xmlns:cx5="http://schemas.microsoft.com/office/drawing/2016/5/11/chartex" xmlns:cx6="http://schemas.microsoft.com/office/drawing/2016/5/12/chartex" xmlns:cx7="http://schemas.microsoft.com/office/drawing/2016/5/13/chartex" xmlns:cx8="http://schemas.microsoft.com/office/drawing/2016/5/14/chartex" xmlns:mc="http://schemas.openxmlformats.org/markup-compatibility/2006" xmlns:aink="http://schemas.microsoft.com/office/drawing/2016/ink" xmlns:am3d="http://schemas.microsoft.com/office/drawing/2017/model3d" xmlns:o="urn:schemas-microsoft-com:office:office" xmlns:oel="http://schemas.microsoft.com/office/2019/extlst" xmlns:r="http://schemas.openxmlformats.org/officeDocument/2006/relationships" xmlns:m="http://schemas.openxmlformats.org/officeDocument/2006/math" xmlns:v="urn:schemas-microsoft-com:vml" xmlns:wp14="http://schemas.microsoft.com/office/word/2010/wordprocessingDrawing" xmlns:wp="http://schemas.openxmlformats.org/drawingml/2006/wordprocessingDrawing" xmlns:w10="urn:schemas-microsoft-com:office:word" xmlns:w="http://schemas.openxmlformats.org/wordprocessingml/2006/main" xmlns:w14="http://schemas.microsoft.com/office/word/2010/wordml" xmlns:w15="http://schemas.microsoft.com/office/word/2012/wordml" xmlns:w16cex="http://schemas.microsoft.com/office/word/2018/wordml/cex" xmlns:w16cid="http://schemas.microsoft.com/office/word/2016/wordml/cid" xmlns:w16="http://schemas.microsoft.com/office/word/2018/wordml" xmlns:w16du="http://schemas.microsoft.com/office/word/2023/wordml/word16du" xmlns:w16sdtdh="http://schemas.microsoft.com/office/word/2020/wordml/sdtdatahash" xmlns:w16sdtfl="http://schemas.microsoft.com/office/word/2024/wordml/sdtformatlock" xmlns:w16se="http://schemas.microsoft.com/office/word/2015/wordml/symex" xmlns:wpg="http://schemas.microsoft.com/office/word/2010/wordprocessingGroup" xmlns:wpi="http://schemas.microsoft.com/office/word/2010/wordprocessingInk" xmlns:wne="http://schemas.microsoft.com/office/word/2006/wordml" xmlns:wps="http://schemas.microsoft.com/office/word/2010/wordprocessingShape" mc:Ignorable="w14 w15 w16se w16cid w16 w16cex w16sdtdh w16sdtfl w16du wp14">
   <w:p>
     <w:pPr>
@@ -5800,7 +5690,7 @@
 </w:ftr>
 </file>
 
-<file path=word\footer3.xml><?xml version="1.0" encoding="utf-8"?>
+<file path=word/footer3.xml><?xml version="1.0" encoding="utf-8"?>
 <w:ftr xmlns:wpc="http://schemas.microsoft.com/office/word/2010/wordprocessingCanvas" xmlns:cx="http://schemas.microsoft.com/office/drawing/2014/chartex" xmlns:cx1="http://schemas.microsoft.com/office/drawing/2015/9/8/chartex" xmlns:cx2="http://schemas.microsoft.com/office/drawing/2015/10/21/chartex" xmlns:cx3="http://schemas.microsoft.com/office/drawing/2016/5/9/chartex" xmlns:cx4="http://schemas.microsoft.com/office/drawing/2016/5/10/chartex" xmlns:cx5="http://schemas.microsoft.com/office/drawing/2016/5/11/chartex" xmlns:cx6="http://schemas.microsoft.com/office/drawing/2016/5/12/chartex" xmlns:cx7="http://schemas.microsoft.com/office/drawing/2016/5/13/chartex" xmlns:cx8="http://schemas.microsoft.com/office/drawing/2016/5/14/chartex" xmlns:mc="http://schemas.openxmlformats.org/markup-compatibility/2006" xmlns:aink="http://schemas.microsoft.com/office/drawing/2016/ink" xmlns:am3d="http://schemas.microsoft.com/office/drawing/2017/model3d" xmlns:o="urn:schemas-microsoft-com:office:office" xmlns:oel="http://schemas.microsoft.com/office/2019/extlst" xmlns:r="http://schemas.openxmlformats.org/officeDocument/2006/relationships" xmlns:m="http://schemas.openxmlformats.org/officeDocument/2006/math" xmlns:v="urn:schemas-microsoft-com:vml" xmlns:wp14="http://schemas.microsoft.com/office/word/2010/wordprocessingDrawing" xmlns:wp="http://schemas.openxmlformats.org/drawingml/2006/wordprocessingDrawing" xmlns:w10="urn:schemas-microsoft-com:office:word" xmlns:w="http://schemas.openxmlformats.org/wordprocessingml/2006/main" xmlns:w14="http://schemas.microsoft.com/office/word/2010/wordml" xmlns:w15="http://schemas.microsoft.com/office/word/2012/wordml" xmlns:w16cex="http://schemas.microsoft.com/office/word/2018/wordml/cex" xmlns:w16cid="http://schemas.microsoft.com/office/word/2016/wordml/cid" xmlns:w16="http://schemas.microsoft.com/office/word/2018/wordml" xmlns:w16du="http://schemas.microsoft.com/office/word/2023/wordml/word16du" xmlns:w16sdtdh="http://schemas.microsoft.com/office/word/2020/wordml/sdtdatahash" xmlns:w16sdtfl="http://schemas.microsoft.com/office/word/2024/wordml/sdtformatlock" xmlns:w16se="http://schemas.microsoft.com/office/word/2015/wordml/symex" xmlns:wpg="http://schemas.microsoft.com/office/word/2010/wordprocessingGroup" xmlns:wpi="http://schemas.microsoft.com/office/word/2010/wordprocessingInk" xmlns:wne="http://schemas.microsoft.com/office/word/2006/wordml" xmlns:wps="http://schemas.microsoft.com/office/word/2010/wordprocessingShape" mc:Ignorable="w14 w15 w16se w16cid w16 w16cex w16sdtdh w16sdtfl w16du wp14">
   <w:p>
     <w:pPr>
@@ -5810,7 +5700,7 @@
 </w:ftr>
 </file>
 
-<file path=word\footnotes.xml><?xml version="1.0" encoding="utf-8"?>
+<file path=word/footnotes.xml><?xml version="1.0" encoding="utf-8"?>
 <w:footnotes xmlns:wpc="http://schemas.microsoft.com/office/word/2010/wordprocessingCanvas" xmlns:cx="http://schemas.microsoft.com/office/drawing/2014/chartex" xmlns:cx1="http://schemas.microsoft.com/office/drawing/2015/9/8/chartex" xmlns:cx2="http://schemas.microsoft.com/office/drawing/2015/10/21/chartex" xmlns:cx3="http://schemas.microsoft.com/office/drawing/2016/5/9/chartex" xmlns:cx4="http://schemas.microsoft.com/office/drawing/2016/5/10/chartex" xmlns:cx5="http://schemas.microsoft.com/office/drawing/2016/5/11/chartex" xmlns:cx6="http://schemas.microsoft.com/office/drawing/2016/5/12/chartex" xmlns:cx7="http://schemas.microsoft.com/office/drawing/2016/5/13/chartex" xmlns:cx8="http://schemas.microsoft.com/office/drawing/2016/5/14/chartex" xmlns:mc="http://schemas.openxmlformats.org/markup-compatibility/2006" xmlns:aink="http://schemas.microsoft.com/office/drawing/2016/ink" xmlns:am3d="http://schemas.microsoft.com/office/drawing/2017/model3d" xmlns:o="urn:schemas-microsoft-com:office:office" xmlns:oel="http://schemas.microsoft.com/office/2019/extlst" xmlns:r="http://schemas.openxmlformats.org/officeDocument/2006/relationships" xmlns:m="http://schemas.openxmlformats.org/officeDocument/2006/math" xmlns:v="urn:schemas-microsoft-com:vml" xmlns:wp14="http://schemas.microsoft.com/office/word/2010/wordprocessingDrawing" xmlns:wp="http://schemas.openxmlformats.org/drawingml/2006/wordprocessingDrawing" xmlns:w10="urn:schemas-microsoft-com:office:word" xmlns:w="http://schemas.openxmlformats.org/wordprocessingml/2006/main" xmlns:w14="http://schemas.microsoft.com/office/word/2010/wordml" xmlns:w15="http://schemas.microsoft.com/office/word/2012/wordml" xmlns:w16cex="http://schemas.microsoft.com/office/word/2018/wordml/cex" xmlns:w16cid="http://schemas.microsoft.com/office/word/2016/wordml/cid" xmlns:w16="http://schemas.microsoft.com/office/word/2018/wordml" xmlns:w16du="http://schemas.microsoft.com/office/word/2023/wordml/word16du" xmlns:w16sdtdh="http://schemas.microsoft.com/office/word/2020/wordml/sdtdatahash" xmlns:w16sdtfl="http://schemas.microsoft.com/office/word/2024/wordml/sdtformatlock" xmlns:w16se="http://schemas.microsoft.com/office/word/2015/wordml/symex" xmlns:wpg="http://schemas.microsoft.com/office/word/2010/wordprocessingGroup" xmlns:wpi="http://schemas.microsoft.com/office/word/2010/wordprocessingInk" xmlns:wne="http://schemas.microsoft.com/office/word/2006/wordml" xmlns:wps="http://schemas.microsoft.com/office/word/2010/wordprocessingShape" mc:Ignorable="w14 w15 w16se w16cid w16 w16cex w16sdtdh w16sdtfl w16du wp14">
   <w:footnote w:type="separator" w:id="-1">
     <w:p>
@@ -5829,7 +5719,7 @@
 </w:footnotes>
 </file>
 
-<file path=word\header1.xml><?xml version="1.0" encoding="utf-8"?>
+<file path=word/header1.xml><?xml version="1.0" encoding="utf-8"?>
 <w:hdr xmlns:wpc="http://schemas.microsoft.com/office/word/2010/wordprocessingCanvas" xmlns:cx="http://schemas.microsoft.com/office/drawing/2014/chartex" xmlns:cx1="http://schemas.microsoft.com/office/drawing/2015/9/8/chartex" xmlns:cx2="http://schemas.microsoft.com/office/drawing/2015/10/21/chartex" xmlns:cx3="http://schemas.microsoft.com/office/drawing/2016/5/9/chartex" xmlns:cx4="http://schemas.microsoft.com/office/drawing/2016/5/10/chartex" xmlns:cx5="http://schemas.microsoft.com/office/drawing/2016/5/11/chartex" xmlns:cx6="http://schemas.microsoft.com/office/drawing/2016/5/12/chartex" xmlns:cx7="http://schemas.microsoft.com/office/drawing/2016/5/13/chartex" xmlns:cx8="http://schemas.microsoft.com/office/drawing/2016/5/14/chartex" xmlns:mc="http://schemas.openxmlformats.org/markup-compatibility/2006" xmlns:aink="http://schemas.microsoft.com/office/drawing/2016/ink" xmlns:am3d="http://schemas.microsoft.com/office/drawing/2017/model3d" xmlns:o="urn:schemas-microsoft-com:office:office" xmlns:oel="http://schemas.microsoft.com/office/2019/extlst" xmlns:r="http://schemas.openxmlformats.org/officeDocument/2006/relationships" xmlns:m="http://schemas.openxmlformats.org/officeDocument/2006/math" xmlns:v="urn:schemas-microsoft-com:vml" xmlns:wp14="http://schemas.microsoft.com/office/word/2010/wordprocessingDrawing" xmlns:wp="http://schemas.openxmlformats.org/drawingml/2006/wordprocessingDrawing" xmlns:w10="urn:schemas-microsoft-com:office:word" xmlns:w="http://schemas.openxmlformats.org/wordprocessingml/2006/main" xmlns:w14="http://schemas.microsoft.com/office/word/2010/wordml" xmlns:w15="http://schemas.microsoft.com/office/word/2012/wordml" xmlns:w16cex="http://schemas.microsoft.com/office/word/2018/wordml/cex" xmlns:w16cid="http://schemas.microsoft.com/office/word/2016/wordml/cid" xmlns:w16="http://schemas.microsoft.com/office/word/2018/wordml" xmlns:w16du="http://schemas.microsoft.com/office/word/2023/wordml/word16du" xmlns:w16sdtdh="http://schemas.microsoft.com/office/word/2020/wordml/sdtdatahash" xmlns:w16sdtfl="http://schemas.microsoft.com/office/word/2024/wordml/sdtformatlock" xmlns:w16se="http://schemas.microsoft.com/office/word/2015/wordml/symex" xmlns:wpg="http://schemas.microsoft.com/office/word/2010/wordprocessingGroup" xmlns:wpi="http://schemas.microsoft.com/office/word/2010/wordprocessingInk" xmlns:wne="http://schemas.microsoft.com/office/word/2006/wordml" xmlns:wps="http://schemas.microsoft.com/office/word/2010/wordprocessingShape" mc:Ignorable="w14 w15 w16se w16cid w16 w16cex w16sdtdh w16sdtfl w16du wp14">
   <w:p>
     <w:pPr>
@@ -5839,7 +5729,7 @@
 </w:hdr>
 </file>
 
-<file path=word\header2.xml><?xml version="1.0" encoding="utf-8"?>
+<file path=word/header2.xml><?xml version="1.0" encoding="utf-8"?>
 <w:hdr xmlns:wpc="http://schemas.microsoft.com/office/word/2010/wordprocessingCanvas" xmlns:cx="http://schemas.microsoft.com/office/drawing/2014/chartex" xmlns:cx1="http://schemas.microsoft.com/office/drawing/2015/9/8/chartex" xmlns:cx2="http://schemas.microsoft.com/office/drawing/2015/10/21/chartex" xmlns:cx3="http://schemas.microsoft.com/office/drawing/2016/5/9/chartex" xmlns:cx4="http://schemas.microsoft.com/office/drawing/2016/5/10/chartex" xmlns:cx5="http://schemas.microsoft.com/office/drawing/2016/5/11/chartex" xmlns:cx6="http://schemas.microsoft.com/office/drawing/2016/5/12/chartex" xmlns:cx7="http://schemas.microsoft.com/office/drawing/2016/5/13/chartex" xmlns:cx8="http://schemas.microsoft.com/office/drawing/2016/5/14/chartex" xmlns:mc="http://schemas.openxmlformats.org/markup-compatibility/2006" xmlns:aink="http://schemas.microsoft.com/office/drawing/2016/ink" xmlns:am3d="http://schemas.microsoft.com/office/drawing/2017/model3d" xmlns:o="urn:schemas-microsoft-com:office:office" xmlns:oel="http://schemas.microsoft.com/office/2019/extlst" xmlns:r="http://schemas.openxmlformats.org/officeDocument/2006/relationships" xmlns:m="http://schemas.openxmlformats.org/officeDocument/2006/math" xmlns:v="urn:schemas-microsoft-com:vml" xmlns:wp14="http://schemas.microsoft.com/office/word/2010/wordprocessingDrawing" xmlns:wp="http://schemas.openxmlformats.org/drawingml/2006/wordprocessingDrawing" xmlns:w10="urn:schemas-microsoft-com:office:word" xmlns:w="http://schemas.openxmlformats.org/wordprocessingml/2006/main" xmlns:w14="http://schemas.microsoft.com/office/word/2010/wordml" xmlns:w15="http://schemas.microsoft.com/office/word/2012/wordml" xmlns:w16cex="http://schemas.microsoft.com/office/word/2018/wordml/cex" xmlns:w16cid="http://schemas.microsoft.com/office/word/2016/wordml/cid" xmlns:w16="http://schemas.microsoft.com/office/word/2018/wordml" xmlns:w16du="http://schemas.microsoft.com/office/word/2023/wordml/word16du" xmlns:w16sdtdh="http://schemas.microsoft.com/office/word/2020/wordml/sdtdatahash" xmlns:w16sdtfl="http://schemas.microsoft.com/office/word/2024/wordml/sdtformatlock" xmlns:w16se="http://schemas.microsoft.com/office/word/2015/wordml/symex" xmlns:wpg="http://schemas.microsoft.com/office/word/2010/wordprocessingGroup" xmlns:wpi="http://schemas.microsoft.com/office/word/2010/wordprocessingInk" xmlns:wne="http://schemas.microsoft.com/office/word/2006/wordml" xmlns:wps="http://schemas.microsoft.com/office/word/2010/wordprocessingShape" mc:Ignorable="w14 w15 w16se w16cid w16 w16cex w16sdtdh w16sdtfl w16du wp14">
   <w:p>
     <w:pPr>
@@ -5854,7 +5744,7 @@
 </w:hdr>
 </file>
 
-<file path=word\header3.xml><?xml version="1.0" encoding="utf-8"?>
+<file path=word/header3.xml><?xml version="1.0" encoding="utf-8"?>
 <w:hdr xmlns:wpc="http://schemas.microsoft.com/office/word/2010/wordprocessingCanvas" xmlns:cx="http://schemas.microsoft.com/office/drawing/2014/chartex" xmlns:cx1="http://schemas.microsoft.com/office/drawing/2015/9/8/chartex" xmlns:cx2="http://schemas.microsoft.com/office/drawing/2015/10/21/chartex" xmlns:cx3="http://schemas.microsoft.com/office/drawing/2016/5/9/chartex" xmlns:cx4="http://schemas.microsoft.com/office/drawing/2016/5/10/chartex" xmlns:cx5="http://schemas.microsoft.com/office/drawing/2016/5/11/chartex" xmlns:cx6="http://schemas.microsoft.com/office/drawing/2016/5/12/chartex" xmlns:cx7="http://schemas.microsoft.com/office/drawing/2016/5/13/chartex" xmlns:cx8="http://schemas.microsoft.com/office/drawing/2016/5/14/chartex" xmlns:mc="http://schemas.openxmlformats.org/markup-compatibility/2006" xmlns:aink="http://schemas.microsoft.com/office/drawing/2016/ink" xmlns:am3d="http://schemas.microsoft.com/office/drawing/2017/model3d" xmlns:o="urn:schemas-microsoft-com:office:office" xmlns:oel="http://schemas.microsoft.com/office/2019/extlst" xmlns:r="http://schemas.openxmlformats.org/officeDocument/2006/relationships" xmlns:m="http://schemas.openxmlformats.org/officeDocument/2006/math" xmlns:v="urn:schemas-microsoft-com:vml" xmlns:wp14="http://schemas.microsoft.com/office/word/2010/wordprocessingDrawing" xmlns:wp="http://schemas.openxmlformats.org/drawingml/2006/wordprocessingDrawing" xmlns:w10="urn:schemas-microsoft-com:office:word" xmlns:w="http://schemas.openxmlformats.org/wordprocessingml/2006/main" xmlns:w14="http://schemas.microsoft.com/office/word/2010/wordml" xmlns:w15="http://schemas.microsoft.com/office/word/2012/wordml" xmlns:w16cex="http://schemas.microsoft.com/office/word/2018/wordml/cex" xmlns:w16cid="http://schemas.microsoft.com/office/word/2016/wordml/cid" xmlns:w16="http://schemas.microsoft.com/office/word/2018/wordml" xmlns:w16du="http://schemas.microsoft.com/office/word/2023/wordml/word16du" xmlns:w16sdtdh="http://schemas.microsoft.com/office/word/2020/wordml/sdtdatahash" xmlns:w16sdtfl="http://schemas.microsoft.com/office/word/2024/wordml/sdtformatlock" xmlns:w16se="http://schemas.microsoft.com/office/word/2015/wordml/symex" xmlns:wpg="http://schemas.microsoft.com/office/word/2010/wordprocessingGroup" xmlns:wpi="http://schemas.microsoft.com/office/word/2010/wordprocessingInk" xmlns:wne="http://schemas.microsoft.com/office/word/2006/wordml" xmlns:wps="http://schemas.microsoft.com/office/word/2010/wordprocessingShape" mc:Ignorable="w14 w15 w16se w16cid w16 w16cex w16sdtdh w16sdtfl w16du wp14">
   <w:p>
     <w:pPr>
@@ -5864,7 +5754,7 @@
 </w:hdr>
 </file>
 
-<file path=word\numbering.xml><?xml version="1.0" encoding="utf-8"?>
+<file path=word/numbering.xml><?xml version="1.0" encoding="utf-8"?>
 <w:numbering xmlns:wpc="http://schemas.microsoft.com/office/word/2010/wordprocessingCanvas" xmlns:cx="http://schemas.microsoft.com/office/drawing/2014/chartex" xmlns:cx1="http://schemas.microsoft.com/office/drawing/2015/9/8/chartex" xmlns:cx2="http://schemas.microsoft.com/office/drawing/2015/10/21/chartex" xmlns:cx3="http://schemas.microsoft.com/office/drawing/2016/5/9/chartex" xmlns:cx4="http://schemas.microsoft.com/office/drawing/2016/5/10/chartex" xmlns:cx5="http://schemas.microsoft.com/office/drawing/2016/5/11/chartex" xmlns:cx6="http://schemas.microsoft.com/office/drawing/2016/5/12/chartex" xmlns:cx7="http://schemas.microsoft.com/office/drawing/2016/5/13/chartex" xmlns:cx8="http://schemas.microsoft.com/office/drawing/2016/5/14/chartex" xmlns:mc="http://schemas.openxmlformats.org/markup-compatibility/2006" xmlns:aink="http://schemas.microsoft.com/office/drawing/2016/ink" xmlns:am3d="http://schemas.microsoft.com/office/drawing/2017/model3d" xmlns:o="urn:schemas-microsoft-com:office:office" xmlns:oel="http://schemas.microsoft.com/office/2019/extlst" xmlns:r="http://schemas.openxmlformats.org/officeDocument/2006/relationships" xmlns:m="http://schemas.openxmlformats.org/officeDocument/2006/math" xmlns:v="urn:schemas-microsoft-com:vml" xmlns:wp14="http://schemas.microsoft.com/office/word/2010/wordprocessingDrawing" xmlns:wp="http://schemas.openxmlformats.org/drawingml/2006/wordprocessingDrawing" xmlns:w10="urn:schemas-microsoft-com:office:word" xmlns:w="http://schemas.openxmlformats.org/wordprocessingml/2006/main" xmlns:w14="http://schemas.microsoft.com/office/word/2010/wordml" xmlns:w15="http://schemas.microsoft.com/office/word/2012/wordml" xmlns:w16cex="http://schemas.microsoft.com/office/word/2018/wordml/cex" xmlns:w16cid="http://schemas.microsoft.com/office/word/2016/wordml/cid" xmlns:w16="http://schemas.microsoft.com/office/word/2018/wordml" xmlns:w16du="http://schemas.microsoft.com/office/word/2023/wordml/word16du" xmlns:w16sdtdh="http://schemas.microsoft.com/office/word/2020/wordml/sdtdatahash" xmlns:w16sdtfl="http://schemas.microsoft.com/office/word/2024/wordml/sdtformatlock" xmlns:w16se="http://schemas.microsoft.com/office/word/2015/wordml/symex" xmlns:wpg="http://schemas.microsoft.com/office/word/2010/wordprocessingGroup" xmlns:wpi="http://schemas.microsoft.com/office/word/2010/wordprocessingInk" xmlns:wne="http://schemas.microsoft.com/office/word/2006/wordml" xmlns:wps="http://schemas.microsoft.com/office/word/2010/wordprocessingShape" mc:Ignorable="w14 w15 w16se w16cid w16 w16cex w16sdtdh w16sdtfl w16du wp14">
   <w:abstractNum w:abstractNumId="0" w15:restartNumberingAfterBreak="0">
     <w:nsid w:val="0EBD1D77"/>
@@ -7839,894 +7729,7 @@
 </w:numbering>
 </file>
 
-<file path=word\settings.xml><?xml version="1.0" encoding="utf-8"?>
-<w:settings xmlns:mc="http://schemas.openxmlformats.org/markup-compatibility/2006" xmlns:o="urn:schemas-microsoft-com:office:office" xmlns:r="http://schemas.openxmlformats.org/officeDocument/2006/relationships" xmlns:m="http://schemas.openxmlformats.org/officeDocument/2006/math" xmlns:v="urn:schemas-microsoft-com:vml" xmlns:w10="urn:schemas-microsoft-com:office:word" xmlns:w="http://schemas.openxmlformats.org/wordprocessingml/2006/main" xmlns:w14="http://schemas.microsoft.com/office/word/2010/wordml" xmlns:w15="http://schemas.microsoft.com/office/word/2012/wordml" xmlns:w16cex="http://schemas.microsoft.com/office/word/2018/wordml/cex" xmlns:w16cid="http://schemas.microsoft.com/office/word/2016/wordml/cid" xmlns:w16="http://schemas.microsoft.com/office/word/2018/wordml" xmlns:w16du="http://schemas.microsoft.com/office/word/2023/wordml/word16du" xmlns:w16sdtdh="http://schemas.microsoft.com/office/word/2020/wordml/sdtdatahash" xmlns:w16sdtfl="http://schemas.microsoft.com/office/word/2024/wordml/sdtformatlock" xmlns:w16se="http://schemas.microsoft.com/office/word/2015/wordml/symex" xmlns:sl="http://schemas.openxmlformats.org/schemaLibrary/2006/main" mc:Ignorable="w14 w15 w16se w16cid w16 w16cex w16sdtdh w16sdtfl w16du">
-  <w:zoom w:percent="100"/>
-  <w:embedSystemFonts/>
-  <w:proofState w:spelling="clean" w:grammar="clean"/>
-  <w:stylePaneFormatFilter w:val="3F01" w:allStyles="1" w:customStyles="0" w:latentStyles="0" w:stylesInUse="0" w:headingStyles="0" w:numberingStyles="0" w:tableStyles="0" w:directFormattingOnRuns="1" w:directFormattingOnParagraphs="1" w:directFormattingOnNumbering="1" w:directFormattingOnTables="1" w:clearFormatting="1" w:top3HeadingStyles="1" w:visibleStyles="0" w:alternateStyleNames="0"/>
-  <w:defaultTabStop w:val="708"/>
-  <w:hyphenationZone w:val="425"/>
-  <w:displayHorizontalDrawingGridEvery w:val="0"/>
-  <w:displayVerticalDrawingGridEvery w:val="0"/>
-  <w:doNotUseMarginsForDrawingGridOrigin/>
-  <w:noPunctuationKerning/>
-  <w:characterSpacingControl w:val="doNotCompress"/>
-  <w:footnotePr>
-    <w:footnote w:id="-1"/>
-    <w:footnote w:id="0"/>
-  </w:footnotePr>
-  <w:endnotePr>
-    <w:endnote w:id="-1"/>
-    <w:endnote w:id="0"/>
-  </w:endnotePr>
-  <w:compat>
-    <w:compatSetting w:name="compatibilityMode" w:uri="http://schemas.microsoft.com/office/word" w:val="15"/>
-    <w:compatSetting w:name="overrideTableStyleFontSizeAndJustification" w:uri="http://schemas.microsoft.com/office/word" w:val="1"/>
-    <w:compatSetting w:name="enableOpenTypeFeatures" w:uri="http://schemas.microsoft.com/office/word" w:val="1"/>
-    <w:compatSetting w:name="doNotFlipMirrorIndents" w:uri="http://schemas.microsoft.com/office/word" w:val="1"/>
-    <w:compatSetting w:name="differentiateMultirowTableHeaders" w:uri="http://schemas.microsoft.com/office/word" w:val="1"/>
-    <w:compatSetting w:name="useWord2013TrackBottomHyphenation" w:uri="http://schemas.microsoft.com/office/word" w:val="1"/>
-  </w:compat>
-  <w:rsids>
-    <w:rsidRoot w:val="00301E16"/>
-    <w:rsid w:val="0000019A"/>
-    <w:rsid w:val="000028D8"/>
-    <w:rsid w:val="000029C5"/>
-    <w:rsid w:val="00004692"/>
-    <w:rsid w:val="000046B4"/>
-    <w:rsid w:val="00004AC5"/>
-    <w:rsid w:val="000054D3"/>
-    <w:rsid w:val="00006CA4"/>
-    <w:rsid w:val="00007587"/>
-    <w:rsid w:val="000231ED"/>
-    <w:rsid w:val="00023CBF"/>
-    <w:rsid w:val="00023DC2"/>
-    <w:rsid w:val="000256F2"/>
-    <w:rsid w:val="00027A0D"/>
-    <w:rsid w:val="00031B2F"/>
-    <w:rsid w:val="00032273"/>
-    <w:rsid w:val="000454DA"/>
-    <w:rsid w:val="0006295D"/>
-    <w:rsid w:val="000665FB"/>
-    <w:rsid w:val="00067A63"/>
-    <w:rsid w:val="00072D9F"/>
-    <w:rsid w:val="00072F43"/>
-    <w:rsid w:val="000744BA"/>
-    <w:rsid w:val="00076B39"/>
-    <w:rsid w:val="00077021"/>
-    <w:rsid w:val="00080D1E"/>
-    <w:rsid w:val="00081832"/>
-    <w:rsid w:val="0008283C"/>
-    <w:rsid w:val="00082D9E"/>
-    <w:rsid w:val="0008603E"/>
-    <w:rsid w:val="00087DCD"/>
-    <w:rsid w:val="00090F33"/>
-    <w:rsid w:val="00095183"/>
-    <w:rsid w:val="000A0D40"/>
-    <w:rsid w:val="000A73D9"/>
-    <w:rsid w:val="000B074A"/>
-    <w:rsid w:val="000B6CE3"/>
-    <w:rsid w:val="000C1F8D"/>
-    <w:rsid w:val="000C4345"/>
-    <w:rsid w:val="000D2BDE"/>
-    <w:rsid w:val="000D4349"/>
-    <w:rsid w:val="000D4E36"/>
-    <w:rsid w:val="000D64EC"/>
-    <w:rsid w:val="000E0247"/>
-    <w:rsid w:val="000E3CFC"/>
-    <w:rsid w:val="000E46BE"/>
-    <w:rsid w:val="000F1705"/>
-    <w:rsid w:val="000F249E"/>
-    <w:rsid w:val="000F2DBA"/>
-    <w:rsid w:val="000F6EC8"/>
-    <w:rsid w:val="0010457D"/>
-    <w:rsid w:val="001124BB"/>
-    <w:rsid w:val="00112DF4"/>
-    <w:rsid w:val="0011475B"/>
-    <w:rsid w:val="00125707"/>
-    <w:rsid w:val="00127620"/>
-    <w:rsid w:val="00133ECA"/>
-    <w:rsid w:val="00134054"/>
-    <w:rsid w:val="00134A02"/>
-    <w:rsid w:val="00142366"/>
-    <w:rsid w:val="0015311D"/>
-    <w:rsid w:val="001534EC"/>
-    <w:rsid w:val="00160FE6"/>
-    <w:rsid w:val="0017122D"/>
-    <w:rsid w:val="0017151A"/>
-    <w:rsid w:val="00171BB8"/>
-    <w:rsid w:val="001723DD"/>
-    <w:rsid w:val="001725A7"/>
-    <w:rsid w:val="0017353B"/>
-    <w:rsid w:val="00175FE2"/>
-    <w:rsid w:val="001865C0"/>
-    <w:rsid w:val="0019290C"/>
-    <w:rsid w:val="001935FF"/>
-    <w:rsid w:val="00193EDB"/>
-    <w:rsid w:val="001A0BE4"/>
-    <w:rsid w:val="001A558F"/>
-    <w:rsid w:val="001B4489"/>
-    <w:rsid w:val="001B664B"/>
-    <w:rsid w:val="001C55A8"/>
-    <w:rsid w:val="001D09B2"/>
-    <w:rsid w:val="001D2415"/>
-    <w:rsid w:val="001D2456"/>
-    <w:rsid w:val="001D5247"/>
-    <w:rsid w:val="001D6156"/>
-    <w:rsid w:val="001E3D15"/>
-    <w:rsid w:val="001E3D48"/>
-    <w:rsid w:val="001E60E2"/>
-    <w:rsid w:val="001E67FC"/>
-    <w:rsid w:val="001E7364"/>
-    <w:rsid w:val="001F0335"/>
-    <w:rsid w:val="001F2689"/>
-    <w:rsid w:val="001F2C3E"/>
-    <w:rsid w:val="001F48B5"/>
-    <w:rsid w:val="00200CA1"/>
-    <w:rsid w:val="00201452"/>
-    <w:rsid w:val="00201CCA"/>
-    <w:rsid w:val="0020289F"/>
-    <w:rsid w:val="002054C1"/>
-    <w:rsid w:val="00206B88"/>
-    <w:rsid w:val="00210FA2"/>
-    <w:rsid w:val="002112C8"/>
-    <w:rsid w:val="00221338"/>
-    <w:rsid w:val="00231237"/>
-    <w:rsid w:val="00240744"/>
-    <w:rsid w:val="002415E2"/>
-    <w:rsid w:val="00242673"/>
-    <w:rsid w:val="0024331E"/>
-    <w:rsid w:val="00243BCA"/>
-    <w:rsid w:val="00245986"/>
-    <w:rsid w:val="00250F69"/>
-    <w:rsid w:val="00251822"/>
-    <w:rsid w:val="00253005"/>
-    <w:rsid w:val="00253900"/>
-    <w:rsid w:val="002549A0"/>
-    <w:rsid w:val="0025503F"/>
-    <w:rsid w:val="00257F19"/>
-    <w:rsid w:val="002609A1"/>
-    <w:rsid w:val="0027160C"/>
-    <w:rsid w:val="00274C05"/>
-    <w:rsid w:val="0027641B"/>
-    <w:rsid w:val="002776E3"/>
-    <w:rsid w:val="00277A0F"/>
-    <w:rsid w:val="00280AD1"/>
-    <w:rsid w:val="0028152A"/>
-    <w:rsid w:val="002823EA"/>
-    <w:rsid w:val="00286930"/>
-    <w:rsid w:val="00294E33"/>
-    <w:rsid w:val="002972BC"/>
-    <w:rsid w:val="002A0452"/>
-    <w:rsid w:val="002A2011"/>
-    <w:rsid w:val="002A37F4"/>
-    <w:rsid w:val="002A3DD1"/>
-    <w:rsid w:val="002A6A35"/>
-    <w:rsid w:val="002B5165"/>
-    <w:rsid w:val="002C2048"/>
-    <w:rsid w:val="002D30F4"/>
-    <w:rsid w:val="002D3D19"/>
-    <w:rsid w:val="002D692B"/>
-    <w:rsid w:val="002D6EE4"/>
-    <w:rsid w:val="002D7F36"/>
-    <w:rsid w:val="002E2FF2"/>
-    <w:rsid w:val="002E5C26"/>
-    <w:rsid w:val="002F0983"/>
-    <w:rsid w:val="002F29CF"/>
-    <w:rsid w:val="002F3F4A"/>
-    <w:rsid w:val="002F571D"/>
-    <w:rsid w:val="002F62A6"/>
-    <w:rsid w:val="002F6D43"/>
-    <w:rsid w:val="003001FC"/>
-    <w:rsid w:val="00301E16"/>
-    <w:rsid w:val="00304489"/>
-    <w:rsid w:val="0031699E"/>
-    <w:rsid w:val="00321A7C"/>
-    <w:rsid w:val="00322390"/>
-    <w:rsid w:val="00323BBA"/>
-    <w:rsid w:val="003243DD"/>
-    <w:rsid w:val="0032443C"/>
-    <w:rsid w:val="00327FA1"/>
-    <w:rsid w:val="0033115D"/>
-    <w:rsid w:val="00334FDC"/>
-    <w:rsid w:val="00344077"/>
-    <w:rsid w:val="003479F4"/>
-    <w:rsid w:val="00351CB3"/>
-    <w:rsid w:val="00353639"/>
-    <w:rsid w:val="0035763F"/>
-    <w:rsid w:val="003625C6"/>
-    <w:rsid w:val="00363B2B"/>
-    <w:rsid w:val="0036709E"/>
-    <w:rsid w:val="0037047F"/>
-    <w:rsid w:val="00375EF4"/>
-    <w:rsid w:val="0038118F"/>
-    <w:rsid w:val="00387912"/>
-    <w:rsid w:val="0039163D"/>
-    <w:rsid w:val="00396260"/>
-    <w:rsid w:val="00397BF3"/>
-    <w:rsid w:val="003A2165"/>
-    <w:rsid w:val="003A3593"/>
-    <w:rsid w:val="003A3F05"/>
-    <w:rsid w:val="003A47C4"/>
-    <w:rsid w:val="003A6D0C"/>
-    <w:rsid w:val="003B61CD"/>
-    <w:rsid w:val="003C17BD"/>
-    <w:rsid w:val="003C21E6"/>
-    <w:rsid w:val="003C45E5"/>
-    <w:rsid w:val="003C4852"/>
-    <w:rsid w:val="003C506C"/>
-    <w:rsid w:val="003C5241"/>
-    <w:rsid w:val="003C61DC"/>
-    <w:rsid w:val="003C64D0"/>
-    <w:rsid w:val="003D0CE2"/>
-    <w:rsid w:val="003D11D4"/>
-    <w:rsid w:val="003D26E9"/>
-    <w:rsid w:val="003D2FAF"/>
-    <w:rsid w:val="003D4A91"/>
-    <w:rsid w:val="003E16AD"/>
-    <w:rsid w:val="003E1DDF"/>
-    <w:rsid w:val="003E6770"/>
-    <w:rsid w:val="003F1B20"/>
-    <w:rsid w:val="003F255C"/>
-    <w:rsid w:val="003F38DE"/>
-    <w:rsid w:val="003F4410"/>
-    <w:rsid w:val="003F4D5A"/>
-    <w:rsid w:val="003F68DA"/>
-    <w:rsid w:val="003F6D60"/>
-    <w:rsid w:val="0040097E"/>
-    <w:rsid w:val="00403376"/>
-    <w:rsid w:val="0040351C"/>
-    <w:rsid w:val="00403DC6"/>
-    <w:rsid w:val="004044FD"/>
-    <w:rsid w:val="004065BA"/>
-    <w:rsid w:val="00416CD3"/>
-    <w:rsid w:val="00417C82"/>
-    <w:rsid w:val="00417D8A"/>
-    <w:rsid w:val="0042113D"/>
-    <w:rsid w:val="00421344"/>
-    <w:rsid w:val="004258A7"/>
-    <w:rsid w:val="00426D06"/>
-    <w:rsid w:val="00431E08"/>
-    <w:rsid w:val="00433130"/>
-    <w:rsid w:val="00434A62"/>
-    <w:rsid w:val="004361A1"/>
-    <w:rsid w:val="00440A83"/>
-    <w:rsid w:val="00465F74"/>
-    <w:rsid w:val="00470FE8"/>
-    <w:rsid w:val="00472D16"/>
-    <w:rsid w:val="00474302"/>
-    <w:rsid w:val="00482E7A"/>
-    <w:rsid w:val="00483598"/>
-    <w:rsid w:val="004876ED"/>
-    <w:rsid w:val="00492E56"/>
-    <w:rsid w:val="00494988"/>
-    <w:rsid w:val="004A37AB"/>
-    <w:rsid w:val="004A5798"/>
-    <w:rsid w:val="004A5883"/>
-    <w:rsid w:val="004A6994"/>
-    <w:rsid w:val="004B6EE0"/>
-    <w:rsid w:val="004B767F"/>
-    <w:rsid w:val="004B7DA7"/>
-    <w:rsid w:val="004C0470"/>
-    <w:rsid w:val="004C41BE"/>
-    <w:rsid w:val="004C464A"/>
-    <w:rsid w:val="004D205D"/>
-    <w:rsid w:val="004D21A6"/>
-    <w:rsid w:val="004D4F73"/>
-    <w:rsid w:val="004E0359"/>
-    <w:rsid w:val="004E28FB"/>
-    <w:rsid w:val="004E3E0B"/>
-    <w:rsid w:val="004F23F1"/>
-    <w:rsid w:val="004F4842"/>
-    <w:rsid w:val="004F5BBF"/>
-    <w:rsid w:val="005015C0"/>
-    <w:rsid w:val="0050280C"/>
-    <w:rsid w:val="005040A8"/>
-    <w:rsid w:val="005040EC"/>
-    <w:rsid w:val="005068A1"/>
-    <w:rsid w:val="005142E8"/>
-    <w:rsid w:val="00514BE7"/>
-    <w:rsid w:val="00517DF3"/>
-    <w:rsid w:val="0052225A"/>
-    <w:rsid w:val="005231CF"/>
-    <w:rsid w:val="005236FB"/>
-    <w:rsid w:val="0052727D"/>
-    <w:rsid w:val="0053007B"/>
-    <w:rsid w:val="0053133E"/>
-    <w:rsid w:val="0053184B"/>
-    <w:rsid w:val="00531913"/>
-    <w:rsid w:val="005377C4"/>
-    <w:rsid w:val="005411F6"/>
-    <w:rsid w:val="00546A08"/>
-    <w:rsid w:val="005475B8"/>
-    <w:rsid w:val="00552034"/>
-    <w:rsid w:val="00555948"/>
-    <w:rsid w:val="00555D5B"/>
-    <w:rsid w:val="0055656A"/>
-    <w:rsid w:val="005570C4"/>
-    <w:rsid w:val="00560D23"/>
-    <w:rsid w:val="00562B82"/>
-    <w:rsid w:val="00562C60"/>
-    <w:rsid w:val="00563CBF"/>
-    <w:rsid w:val="00565C4C"/>
-    <w:rsid w:val="005670EC"/>
-    <w:rsid w:val="00567B49"/>
-    <w:rsid w:val="00567BAE"/>
-    <w:rsid w:val="005701B5"/>
-    <w:rsid w:val="00571674"/>
-    <w:rsid w:val="00571698"/>
-    <w:rsid w:val="00573DB6"/>
-    <w:rsid w:val="00575D3D"/>
-    <w:rsid w:val="00591EA7"/>
-    <w:rsid w:val="00592065"/>
-    <w:rsid w:val="00594FC5"/>
-    <w:rsid w:val="005971A0"/>
-    <w:rsid w:val="005A0568"/>
-    <w:rsid w:val="005C0FB4"/>
-    <w:rsid w:val="005C18E1"/>
-    <w:rsid w:val="005C3AA4"/>
-    <w:rsid w:val="005C71AF"/>
-    <w:rsid w:val="005D0D62"/>
-    <w:rsid w:val="005D38A9"/>
-    <w:rsid w:val="005D759E"/>
-    <w:rsid w:val="005E086A"/>
-    <w:rsid w:val="005E7D1B"/>
-    <w:rsid w:val="005E7F75"/>
-    <w:rsid w:val="005F0FDC"/>
-    <w:rsid w:val="005F53EF"/>
-    <w:rsid w:val="00602F0E"/>
-    <w:rsid w:val="00603D19"/>
-    <w:rsid w:val="00604235"/>
-    <w:rsid w:val="006053E4"/>
-    <w:rsid w:val="00607E3F"/>
-    <w:rsid w:val="006100F9"/>
-    <w:rsid w:val="00612568"/>
-    <w:rsid w:val="006210B2"/>
-    <w:rsid w:val="00624ACD"/>
-    <w:rsid w:val="00627B5D"/>
-    <w:rsid w:val="00634735"/>
-    <w:rsid w:val="00642076"/>
-    <w:rsid w:val="00643BAA"/>
-    <w:rsid w:val="00643E69"/>
-    <w:rsid w:val="00646C74"/>
-    <w:rsid w:val="006477E2"/>
-    <w:rsid w:val="00650788"/>
-    <w:rsid w:val="00650B21"/>
-    <w:rsid w:val="00652247"/>
-    <w:rsid w:val="00653C02"/>
-    <w:rsid w:val="006542AC"/>
-    <w:rsid w:val="00657375"/>
-    <w:rsid w:val="00662D70"/>
-    <w:rsid w:val="00662F8E"/>
-    <w:rsid w:val="00663BDF"/>
-    <w:rsid w:val="006653AE"/>
-    <w:rsid w:val="006656DE"/>
-    <w:rsid w:val="00665FF1"/>
-    <w:rsid w:val="0067037D"/>
-    <w:rsid w:val="00671049"/>
-    <w:rsid w:val="00675F5B"/>
-    <w:rsid w:val="00676089"/>
-    <w:rsid w:val="00676262"/>
-    <w:rsid w:val="00677819"/>
-    <w:rsid w:val="00680780"/>
-    <w:rsid w:val="006855AD"/>
-    <w:rsid w:val="0068726A"/>
-    <w:rsid w:val="00687739"/>
-    <w:rsid w:val="00693B0D"/>
-    <w:rsid w:val="00694EA2"/>
-    <w:rsid w:val="00695F50"/>
-    <w:rsid w:val="006A1E97"/>
-    <w:rsid w:val="006A539D"/>
-    <w:rsid w:val="006A58BB"/>
-    <w:rsid w:val="006A68C8"/>
-    <w:rsid w:val="006A7F50"/>
-    <w:rsid w:val="006B357D"/>
-    <w:rsid w:val="006B43EF"/>
-    <w:rsid w:val="006B56C8"/>
-    <w:rsid w:val="006B5DDE"/>
-    <w:rsid w:val="006B6272"/>
-    <w:rsid w:val="006C06A4"/>
-    <w:rsid w:val="006C1562"/>
-    <w:rsid w:val="006C5F45"/>
-    <w:rsid w:val="006C7676"/>
-    <w:rsid w:val="006D41C2"/>
-    <w:rsid w:val="006D436B"/>
-    <w:rsid w:val="006E319B"/>
-    <w:rsid w:val="006E694D"/>
-    <w:rsid w:val="006E6964"/>
-    <w:rsid w:val="006F1E26"/>
-    <w:rsid w:val="006F5D44"/>
-    <w:rsid w:val="0070049F"/>
-    <w:rsid w:val="00704E66"/>
-    <w:rsid w:val="00707612"/>
-    <w:rsid w:val="00710922"/>
-    <w:rsid w:val="00710A74"/>
-    <w:rsid w:val="00717B1E"/>
-    <w:rsid w:val="00722010"/>
-    <w:rsid w:val="00722462"/>
-    <w:rsid w:val="00725B90"/>
-    <w:rsid w:val="007271EE"/>
-    <w:rsid w:val="00727592"/>
-    <w:rsid w:val="00727CF7"/>
-    <w:rsid w:val="00730235"/>
-    <w:rsid w:val="00732722"/>
-    <w:rsid w:val="00732E34"/>
-    <w:rsid w:val="007333A1"/>
-    <w:rsid w:val="00736602"/>
-    <w:rsid w:val="00741437"/>
-    <w:rsid w:val="00741610"/>
-    <w:rsid w:val="00741AF9"/>
-    <w:rsid w:val="00743A8F"/>
-    <w:rsid w:val="00746A00"/>
-    <w:rsid w:val="00747580"/>
-    <w:rsid w:val="00751858"/>
-    <w:rsid w:val="0075788B"/>
-    <w:rsid w:val="00757D7C"/>
-    <w:rsid w:val="007643FF"/>
-    <w:rsid w:val="00765EBE"/>
-    <w:rsid w:val="00771157"/>
-    <w:rsid w:val="007714D3"/>
-    <w:rsid w:val="00776526"/>
-    <w:rsid w:val="00785153"/>
-    <w:rsid w:val="007851B5"/>
-    <w:rsid w:val="0079050B"/>
-    <w:rsid w:val="007959FA"/>
-    <w:rsid w:val="007A5165"/>
-    <w:rsid w:val="007A548F"/>
-    <w:rsid w:val="007A5E6D"/>
-    <w:rsid w:val="007B039C"/>
-    <w:rsid w:val="007B090F"/>
-    <w:rsid w:val="007B3083"/>
-    <w:rsid w:val="007B4831"/>
-    <w:rsid w:val="007B569A"/>
-    <w:rsid w:val="007B7C17"/>
-    <w:rsid w:val="007C062F"/>
-    <w:rsid w:val="007C08F5"/>
-    <w:rsid w:val="007C424B"/>
-    <w:rsid w:val="007C54FA"/>
-    <w:rsid w:val="007C6DCF"/>
-    <w:rsid w:val="007D05E2"/>
-    <w:rsid w:val="007D3391"/>
-    <w:rsid w:val="007D55DF"/>
-    <w:rsid w:val="007D56D6"/>
-    <w:rsid w:val="007D5742"/>
-    <w:rsid w:val="007D748E"/>
-    <w:rsid w:val="007F1730"/>
-    <w:rsid w:val="007F4AF9"/>
-    <w:rsid w:val="007F5100"/>
-    <w:rsid w:val="007F51CF"/>
-    <w:rsid w:val="00802597"/>
-    <w:rsid w:val="00803187"/>
-    <w:rsid w:val="00807EAB"/>
-    <w:rsid w:val="00814E5C"/>
-    <w:rsid w:val="00817A6B"/>
-    <w:rsid w:val="00820D71"/>
-    <w:rsid w:val="008215E2"/>
-    <w:rsid w:val="00822207"/>
-    <w:rsid w:val="00823E84"/>
-    <w:rsid w:val="008246EE"/>
-    <w:rsid w:val="00830244"/>
-    <w:rsid w:val="00837DDD"/>
-    <w:rsid w:val="00844E81"/>
-    <w:rsid w:val="00852901"/>
-    <w:rsid w:val="00857222"/>
-    <w:rsid w:val="008647CB"/>
-    <w:rsid w:val="00867EEF"/>
-    <w:rsid w:val="00876EBC"/>
-    <w:rsid w:val="00881B54"/>
-    <w:rsid w:val="00884BFF"/>
-    <w:rsid w:val="00885F6C"/>
-    <w:rsid w:val="00886BC8"/>
-    <w:rsid w:val="00886FDE"/>
-    <w:rsid w:val="00887E3A"/>
-    <w:rsid w:val="00897432"/>
-    <w:rsid w:val="00897B7E"/>
-    <w:rsid w:val="008A073A"/>
-    <w:rsid w:val="008A4F3A"/>
-    <w:rsid w:val="008A4FB1"/>
-    <w:rsid w:val="008A7972"/>
-    <w:rsid w:val="008A7ADE"/>
-    <w:rsid w:val="008B1054"/>
-    <w:rsid w:val="008B41D3"/>
-    <w:rsid w:val="008C393D"/>
-    <w:rsid w:val="008C6671"/>
-    <w:rsid w:val="008C6952"/>
-    <w:rsid w:val="008D5568"/>
-    <w:rsid w:val="008D7C9A"/>
-    <w:rsid w:val="008E0230"/>
-    <w:rsid w:val="008E5754"/>
-    <w:rsid w:val="008E7674"/>
-    <w:rsid w:val="008E7FAA"/>
-    <w:rsid w:val="008F1134"/>
-    <w:rsid w:val="008F6752"/>
-    <w:rsid w:val="00902802"/>
-    <w:rsid w:val="009044DD"/>
-    <w:rsid w:val="00911A1E"/>
-    <w:rsid w:val="0091335A"/>
-    <w:rsid w:val="009134A1"/>
-    <w:rsid w:val="00926A6D"/>
-    <w:rsid w:val="009454C1"/>
-    <w:rsid w:val="0095113B"/>
-    <w:rsid w:val="0095769A"/>
-    <w:rsid w:val="00964ECC"/>
-    <w:rsid w:val="00965946"/>
-    <w:rsid w:val="00970571"/>
-    <w:rsid w:val="00971495"/>
-    <w:rsid w:val="009845F1"/>
-    <w:rsid w:val="0098532C"/>
-    <w:rsid w:val="00985A53"/>
-    <w:rsid w:val="00986FD3"/>
-    <w:rsid w:val="0099094D"/>
-    <w:rsid w:val="00997F34"/>
-    <w:rsid w:val="009A0285"/>
-    <w:rsid w:val="009A07F4"/>
-    <w:rsid w:val="009A25AD"/>
-    <w:rsid w:val="009A45E6"/>
-    <w:rsid w:val="009A76E3"/>
-    <w:rsid w:val="009B0FFA"/>
-    <w:rsid w:val="009B2B89"/>
-    <w:rsid w:val="009B2D32"/>
-    <w:rsid w:val="009B56F1"/>
-    <w:rsid w:val="009B5BAB"/>
-    <w:rsid w:val="009B5C17"/>
-    <w:rsid w:val="009C00AC"/>
-    <w:rsid w:val="009C0412"/>
-    <w:rsid w:val="009C0C26"/>
-    <w:rsid w:val="009C3415"/>
-    <w:rsid w:val="009C3A65"/>
-    <w:rsid w:val="009C6540"/>
-    <w:rsid w:val="009D58D7"/>
-    <w:rsid w:val="009D6EC5"/>
-    <w:rsid w:val="009E03F8"/>
-    <w:rsid w:val="009E5D7B"/>
-    <w:rsid w:val="009E62BB"/>
-    <w:rsid w:val="009E6ACD"/>
-    <w:rsid w:val="009F3177"/>
-    <w:rsid w:val="009F32E4"/>
-    <w:rsid w:val="009F3DF6"/>
-    <w:rsid w:val="009F639C"/>
-    <w:rsid w:val="00A036A8"/>
-    <w:rsid w:val="00A056FF"/>
-    <w:rsid w:val="00A05833"/>
-    <w:rsid w:val="00A062FE"/>
-    <w:rsid w:val="00A120A1"/>
-    <w:rsid w:val="00A20E98"/>
-    <w:rsid w:val="00A31D86"/>
-    <w:rsid w:val="00A31E34"/>
-    <w:rsid w:val="00A323B2"/>
-    <w:rsid w:val="00A3743D"/>
-    <w:rsid w:val="00A43884"/>
-    <w:rsid w:val="00A476C1"/>
-    <w:rsid w:val="00A52BD4"/>
-    <w:rsid w:val="00A57662"/>
-    <w:rsid w:val="00A60F83"/>
-    <w:rsid w:val="00A613A3"/>
-    <w:rsid w:val="00A6270A"/>
-    <w:rsid w:val="00A63751"/>
-    <w:rsid w:val="00A669C4"/>
-    <w:rsid w:val="00A71764"/>
-    <w:rsid w:val="00A7481E"/>
-    <w:rsid w:val="00A7710D"/>
-    <w:rsid w:val="00A824DC"/>
-    <w:rsid w:val="00A8486D"/>
-    <w:rsid w:val="00A862BE"/>
-    <w:rsid w:val="00A9454E"/>
-    <w:rsid w:val="00A9458C"/>
-    <w:rsid w:val="00A96276"/>
-    <w:rsid w:val="00A97FAD"/>
-    <w:rsid w:val="00AB034A"/>
-    <w:rsid w:val="00AB13B3"/>
-    <w:rsid w:val="00AB4579"/>
-    <w:rsid w:val="00AB5D78"/>
-    <w:rsid w:val="00AC2205"/>
-    <w:rsid w:val="00AC37BD"/>
-    <w:rsid w:val="00AD1E47"/>
-    <w:rsid w:val="00AD209A"/>
-    <w:rsid w:val="00AD3A4C"/>
-    <w:rsid w:val="00AD3ABA"/>
-    <w:rsid w:val="00AD3FC0"/>
-    <w:rsid w:val="00AD506F"/>
-    <w:rsid w:val="00AD70A5"/>
-    <w:rsid w:val="00AD7ECF"/>
-    <w:rsid w:val="00AD7F18"/>
-    <w:rsid w:val="00AE3C40"/>
-    <w:rsid w:val="00AE6F65"/>
-    <w:rsid w:val="00AF1332"/>
-    <w:rsid w:val="00AF1DA2"/>
-    <w:rsid w:val="00AF43C1"/>
-    <w:rsid w:val="00AF5210"/>
-    <w:rsid w:val="00B06676"/>
-    <w:rsid w:val="00B0706A"/>
-    <w:rsid w:val="00B12866"/>
-    <w:rsid w:val="00B210C8"/>
-    <w:rsid w:val="00B22C2F"/>
-    <w:rsid w:val="00B22E38"/>
-    <w:rsid w:val="00B3067F"/>
-    <w:rsid w:val="00B40BA3"/>
-    <w:rsid w:val="00B42519"/>
-    <w:rsid w:val="00B43F15"/>
-    <w:rsid w:val="00B453F6"/>
-    <w:rsid w:val="00B45E7C"/>
-    <w:rsid w:val="00B4710C"/>
-    <w:rsid w:val="00B47EAC"/>
-    <w:rsid w:val="00B53B5A"/>
-    <w:rsid w:val="00B61CEE"/>
-    <w:rsid w:val="00B63F37"/>
-    <w:rsid w:val="00B66811"/>
-    <w:rsid w:val="00B675BC"/>
-    <w:rsid w:val="00B75DD0"/>
-    <w:rsid w:val="00B764A4"/>
-    <w:rsid w:val="00B82F4C"/>
-    <w:rsid w:val="00B835F4"/>
-    <w:rsid w:val="00B838DD"/>
-    <w:rsid w:val="00B84419"/>
-    <w:rsid w:val="00B8545A"/>
-    <w:rsid w:val="00B91468"/>
-    <w:rsid w:val="00B925B1"/>
-    <w:rsid w:val="00B93695"/>
-    <w:rsid w:val="00B969A7"/>
-    <w:rsid w:val="00B9780B"/>
-    <w:rsid w:val="00BA144A"/>
-    <w:rsid w:val="00BA2AC8"/>
-    <w:rsid w:val="00BA61C0"/>
-    <w:rsid w:val="00BB3999"/>
-    <w:rsid w:val="00BB3C2E"/>
-    <w:rsid w:val="00BB4A56"/>
-    <w:rsid w:val="00BB7E3D"/>
-    <w:rsid w:val="00BB7E7B"/>
-    <w:rsid w:val="00BC4B94"/>
-    <w:rsid w:val="00BC6B1C"/>
-    <w:rsid w:val="00BC77A9"/>
-    <w:rsid w:val="00BD2B06"/>
-    <w:rsid w:val="00BD3115"/>
-    <w:rsid w:val="00BD5764"/>
-    <w:rsid w:val="00BD5A25"/>
-    <w:rsid w:val="00BE0822"/>
-    <w:rsid w:val="00BE4EA2"/>
-    <w:rsid w:val="00BF134F"/>
-    <w:rsid w:val="00BF30B7"/>
-    <w:rsid w:val="00BF4FF4"/>
-    <w:rsid w:val="00C01BA6"/>
-    <w:rsid w:val="00C01F4A"/>
-    <w:rsid w:val="00C02785"/>
-    <w:rsid w:val="00C02F76"/>
-    <w:rsid w:val="00C0418C"/>
-    <w:rsid w:val="00C04F21"/>
-    <w:rsid w:val="00C11ED3"/>
-    <w:rsid w:val="00C1334E"/>
-    <w:rsid w:val="00C27843"/>
-    <w:rsid w:val="00C37428"/>
-    <w:rsid w:val="00C376C5"/>
-    <w:rsid w:val="00C40697"/>
-    <w:rsid w:val="00C4175C"/>
-    <w:rsid w:val="00C46B37"/>
-    <w:rsid w:val="00C50A47"/>
-    <w:rsid w:val="00C62724"/>
-    <w:rsid w:val="00C731C5"/>
-    <w:rsid w:val="00C73B96"/>
-    <w:rsid w:val="00C75DBF"/>
-    <w:rsid w:val="00C81717"/>
-    <w:rsid w:val="00C842CE"/>
-    <w:rsid w:val="00C85014"/>
-    <w:rsid w:val="00C92787"/>
-    <w:rsid w:val="00C94B80"/>
-    <w:rsid w:val="00C971C8"/>
-    <w:rsid w:val="00CA22C7"/>
-    <w:rsid w:val="00CA2DA3"/>
-    <w:rsid w:val="00CB179A"/>
-    <w:rsid w:val="00CB1A42"/>
-    <w:rsid w:val="00CB423D"/>
-    <w:rsid w:val="00CB6241"/>
-    <w:rsid w:val="00CB6C67"/>
-    <w:rsid w:val="00CC0272"/>
-    <w:rsid w:val="00CC1517"/>
-    <w:rsid w:val="00CC2D3E"/>
-    <w:rsid w:val="00CC4BE5"/>
-    <w:rsid w:val="00CC77B0"/>
-    <w:rsid w:val="00CD0932"/>
-    <w:rsid w:val="00CD0E78"/>
-    <w:rsid w:val="00CD1A73"/>
-    <w:rsid w:val="00CD37A8"/>
-    <w:rsid w:val="00CD66E8"/>
-    <w:rsid w:val="00CE2DA9"/>
-    <w:rsid w:val="00CE5B26"/>
-    <w:rsid w:val="00CF37A2"/>
-    <w:rsid w:val="00CF5101"/>
-    <w:rsid w:val="00CF5B58"/>
-    <w:rsid w:val="00CF752A"/>
-    <w:rsid w:val="00D01F47"/>
-    <w:rsid w:val="00D02D4F"/>
-    <w:rsid w:val="00D0306B"/>
-    <w:rsid w:val="00D051AB"/>
-    <w:rsid w:val="00D073C6"/>
-    <w:rsid w:val="00D10B07"/>
-    <w:rsid w:val="00D1392E"/>
-    <w:rsid w:val="00D21CB4"/>
-    <w:rsid w:val="00D27640"/>
-    <w:rsid w:val="00D30D00"/>
-    <w:rsid w:val="00D31FB1"/>
-    <w:rsid w:val="00D3592D"/>
-    <w:rsid w:val="00D45015"/>
-    <w:rsid w:val="00D51C92"/>
-    <w:rsid w:val="00D54BA1"/>
-    <w:rsid w:val="00D613F0"/>
-    <w:rsid w:val="00D66B10"/>
-    <w:rsid w:val="00D66DE5"/>
-    <w:rsid w:val="00D70014"/>
-    <w:rsid w:val="00D7216A"/>
-    <w:rsid w:val="00D754B6"/>
-    <w:rsid w:val="00D82B24"/>
-    <w:rsid w:val="00D83DA4"/>
-    <w:rsid w:val="00D846F2"/>
-    <w:rsid w:val="00D865B1"/>
-    <w:rsid w:val="00D87BEE"/>
-    <w:rsid w:val="00D93A3D"/>
-    <w:rsid w:val="00D93E43"/>
-    <w:rsid w:val="00D96362"/>
-    <w:rsid w:val="00D96945"/>
-    <w:rsid w:val="00D9730F"/>
-    <w:rsid w:val="00D9790B"/>
-    <w:rsid w:val="00DA0E4D"/>
-    <w:rsid w:val="00DA3373"/>
-    <w:rsid w:val="00DA53B8"/>
-    <w:rsid w:val="00DA5ADB"/>
-    <w:rsid w:val="00DA6127"/>
-    <w:rsid w:val="00DB02B0"/>
-    <w:rsid w:val="00DC0299"/>
-    <w:rsid w:val="00DC0A8D"/>
-    <w:rsid w:val="00DC16FE"/>
-    <w:rsid w:val="00DC1B30"/>
-    <w:rsid w:val="00DC3C9E"/>
-    <w:rsid w:val="00DC437A"/>
-    <w:rsid w:val="00DC4E63"/>
-    <w:rsid w:val="00DC4EA4"/>
-    <w:rsid w:val="00DC6626"/>
-    <w:rsid w:val="00DD64D3"/>
-    <w:rsid w:val="00DD6EFD"/>
-    <w:rsid w:val="00DE0D46"/>
-    <w:rsid w:val="00DE14B8"/>
-    <w:rsid w:val="00DE4A6E"/>
-    <w:rsid w:val="00DE6D38"/>
-    <w:rsid w:val="00DF55E1"/>
-    <w:rsid w:val="00DF614D"/>
-    <w:rsid w:val="00E108E9"/>
-    <w:rsid w:val="00E12330"/>
-    <w:rsid w:val="00E163BF"/>
-    <w:rsid w:val="00E20E7F"/>
-    <w:rsid w:val="00E23B2F"/>
-    <w:rsid w:val="00E2622E"/>
-    <w:rsid w:val="00E278FC"/>
-    <w:rsid w:val="00E31B0B"/>
-    <w:rsid w:val="00E35863"/>
-    <w:rsid w:val="00E36660"/>
-    <w:rsid w:val="00E36AF5"/>
-    <w:rsid w:val="00E36EBF"/>
-    <w:rsid w:val="00E3794E"/>
-    <w:rsid w:val="00E417D9"/>
-    <w:rsid w:val="00E433B3"/>
-    <w:rsid w:val="00E45049"/>
-    <w:rsid w:val="00E46442"/>
-    <w:rsid w:val="00E501A8"/>
-    <w:rsid w:val="00E6306C"/>
-    <w:rsid w:val="00E65C14"/>
-    <w:rsid w:val="00E67E81"/>
-    <w:rsid w:val="00E7009B"/>
-    <w:rsid w:val="00E71A6D"/>
-    <w:rsid w:val="00E71E53"/>
-    <w:rsid w:val="00E741AC"/>
-    <w:rsid w:val="00E843FC"/>
-    <w:rsid w:val="00E856FE"/>
-    <w:rsid w:val="00E9025F"/>
-    <w:rsid w:val="00E97B0D"/>
-    <w:rsid w:val="00EA37B0"/>
-    <w:rsid w:val="00EA5A9C"/>
-    <w:rsid w:val="00EB17F2"/>
-    <w:rsid w:val="00EB1FFC"/>
-    <w:rsid w:val="00EB33D1"/>
-    <w:rsid w:val="00ED1A2B"/>
-    <w:rsid w:val="00ED2790"/>
-    <w:rsid w:val="00ED6CCE"/>
-    <w:rsid w:val="00EE76AF"/>
-    <w:rsid w:val="00EF2B15"/>
-    <w:rsid w:val="00EF328B"/>
-    <w:rsid w:val="00EF49B9"/>
-    <w:rsid w:val="00EF5E9B"/>
-    <w:rsid w:val="00EF7BCC"/>
-    <w:rsid w:val="00F026C1"/>
-    <w:rsid w:val="00F071EF"/>
-    <w:rsid w:val="00F07207"/>
-    <w:rsid w:val="00F21C1D"/>
-    <w:rsid w:val="00F22B4E"/>
-    <w:rsid w:val="00F22E05"/>
-    <w:rsid w:val="00F25E14"/>
-    <w:rsid w:val="00F303D1"/>
-    <w:rsid w:val="00F30A24"/>
-    <w:rsid w:val="00F311DB"/>
-    <w:rsid w:val="00F35DB4"/>
-    <w:rsid w:val="00F40C1B"/>
-    <w:rsid w:val="00F42A41"/>
-    <w:rsid w:val="00F42C03"/>
-    <w:rsid w:val="00F468D6"/>
-    <w:rsid w:val="00F46D87"/>
-    <w:rsid w:val="00F47C8E"/>
-    <w:rsid w:val="00F50E8D"/>
-    <w:rsid w:val="00F50FC4"/>
-    <w:rsid w:val="00F5402B"/>
-    <w:rsid w:val="00F5446E"/>
-    <w:rsid w:val="00F57DEB"/>
-    <w:rsid w:val="00F624F4"/>
-    <w:rsid w:val="00F62CC3"/>
-    <w:rsid w:val="00F62EA8"/>
-    <w:rsid w:val="00F65A75"/>
-    <w:rsid w:val="00F66E26"/>
-    <w:rsid w:val="00F727DB"/>
-    <w:rsid w:val="00F73635"/>
-    <w:rsid w:val="00F8027D"/>
-    <w:rsid w:val="00F86621"/>
-    <w:rsid w:val="00F86701"/>
-    <w:rsid w:val="00F93438"/>
-    <w:rsid w:val="00F94513"/>
-    <w:rsid w:val="00FA1AEE"/>
-    <w:rsid w:val="00FB0195"/>
-    <w:rsid w:val="00FB0382"/>
-    <w:rsid w:val="00FB05CE"/>
-    <w:rsid w:val="00FB1B40"/>
-    <w:rsid w:val="00FB54D3"/>
-    <w:rsid w:val="00FB5B15"/>
-    <w:rsid w:val="00FC2D82"/>
-    <w:rsid w:val="00FC4B03"/>
-    <w:rsid w:val="00FC6A4E"/>
-    <w:rsid w:val="00FD6DAE"/>
-    <w:rsid w:val="00FE2CF1"/>
-    <w:rsid w:val="00FE3CB8"/>
-    <w:rsid w:val="00FF0B85"/>
-    <w:rsid w:val="00FF2159"/>
-    <w:rsid w:val="078C31C9"/>
-    <w:rsid w:val="092EBA9C"/>
-    <w:rsid w:val="0B644A56"/>
-    <w:rsid w:val="1282DA77"/>
-    <w:rsid w:val="15152F30"/>
-    <w:rsid w:val="17B2AFCC"/>
-    <w:rsid w:val="26A00457"/>
-    <w:rsid w:val="65EE4D1A"/>
-    <w:rsid w:val="740CAD6E"/>
-  </w:rsids>
-  <m:mathPr>
-    <m:mathFont m:val="Cambria Math"/>
-    <m:brkBin m:val="before"/>
-    <m:brkBinSub m:val="--"/>
-    <m:smallFrac/>
-    <m:dispDef/>
-    <m:lMargin m:val="0"/>
-    <m:rMargin m:val="0"/>
-    <m:defJc m:val="centerGroup"/>
-    <m:wrapIndent m:val="1440"/>
-    <m:intLim m:val="subSup"/>
-    <m:naryLim m:val="undOvr"/>
-  </m:mathPr>
-  <w:themeFontLang w:val="pt-BR"/>
-  <w:clrSchemeMapping w:bg1="light1" w:t1="dark1" w:bg2="light2" w:t2="dark2" w:accent1="accent1" w:accent2="accent2" w:accent3="accent3" w:accent4="accent4" w:accent5="accent5" w:accent6="accent6" w:hyperlink="hyperlink" w:followedHyperlink="followedHyperlink"/>
-  <w:doNotIncludeSubdocsInStats/>
-  <w:shapeDefaults>
-    <o:shapedefaults v:ext="edit" spidmax="1026" fillcolor="white" stroke="f">
-      <v:fill color="white"/>
-      <v:stroke on="f"/>
-      <v:shadow color="#868686"/>
-    </o:shapedefaults>
-    <o:shapelayout v:ext="edit">
-      <o:idmap v:ext="edit" data="1"/>
-    </o:shapelayout>
-  </w:shapeDefaults>
-  <w:decimalSymbol w:val=","/>
-  <w:listSeparator w:val=";"/>
-  <w14:docId w14:val="0B644A56"/>
-  <w15:chartTrackingRefBased/>
-  <w15:docId w15:val="{EEA4DE7C-8755-4FD2-9C53-0A5E06487691}"/>
-</w:settings>
-</file>
-
-<file path=word\styles.xml><?xml version="1.0" encoding="utf-8"?>
+<file path=word/styles.xml><?xml version="1.0" encoding="utf-8"?>
 <w:styles xmlns:mc="http://schemas.openxmlformats.org/markup-compatibility/2006" xmlns:r="http://schemas.openxmlformats.org/officeDocument/2006/relationships" xmlns:w="http://schemas.openxmlformats.org/wordprocessingml/2006/main" xmlns:w14="http://schemas.microsoft.com/office/word/2010/wordml" xmlns:w15="http://schemas.microsoft.com/office/word/2012/wordml" xmlns:w16cex="http://schemas.microsoft.com/office/word/2018/wordml/cex" xmlns:w16cid="http://schemas.microsoft.com/office/word/2016/wordml/cid" xmlns:w16="http://schemas.microsoft.com/office/word/2018/wordml" xmlns:w16du="http://schemas.microsoft.com/office/word/2023/wordml/word16du" xmlns:w16sdtdh="http://schemas.microsoft.com/office/word/2020/wordml/sdtdatahash" xmlns:w16sdtfl="http://schemas.microsoft.com/office/word/2024/wordml/sdtformatlock" xmlns:w16se="http://schemas.microsoft.com/office/word/2015/wordml/symex" mc:Ignorable="w14 w15 w16se w16cid w16 w16cex w16sdtdh w16sdtfl w16du">
   <w:docDefaults>
     <w:rPrDefault>
@@ -9196,7 +8199,7 @@
 </w:styles>
 </file>
 
-<file path=word\theme\theme1.xml><?xml version="1.0" encoding="utf-8"?>
+<file path=word/theme/theme1.xml><?xml version="1.0" encoding="utf-8"?>
 <a:theme xmlns:a="http://schemas.openxmlformats.org/drawingml/2006/main" name="Tema do Office">
   <a:themeElements>
     <a:clrScheme name="Office">
@@ -9457,30 +8460,7 @@
 </a:theme>
 </file>
 
-<file path=word\webSettings.xml><?xml version="1.0" encoding="utf-8"?>
-<w:webSettings xmlns:mc="http://schemas.openxmlformats.org/markup-compatibility/2006" xmlns:r="http://schemas.openxmlformats.org/officeDocument/2006/relationships" xmlns:w="http://schemas.openxmlformats.org/wordprocessingml/2006/main" xmlns:w14="http://schemas.microsoft.com/office/word/2010/wordml" xmlns:w15="http://schemas.microsoft.com/office/word/2012/wordml" xmlns:w16cex="http://schemas.microsoft.com/office/word/2018/wordml/cex" xmlns:w16cid="http://schemas.microsoft.com/office/word/2016/wordml/cid" xmlns:w16="http://schemas.microsoft.com/office/word/2018/wordml" xmlns:w16du="http://schemas.microsoft.com/office/word/2023/wordml/word16du" xmlns:w16sdtdh="http://schemas.microsoft.com/office/word/2020/wordml/sdtdatahash" xmlns:w16sdtfl="http://schemas.microsoft.com/office/word/2024/wordml/sdtformatlock" xmlns:w16se="http://schemas.microsoft.com/office/word/2015/wordml/symex" mc:Ignorable="w14 w15 w16se w16cid w16 w16cex w16sdtdh w16sdtfl w16du">
-  <w:divs>
-    <w:div w:id="399447810">
-      <w:bodyDiv w:val="1"/>
-      <w:marLeft w:val="0"/>
-      <w:marRight w:val="0"/>
-      <w:marTop w:val="0"/>
-      <w:marBottom w:val="0"/>
-      <w:divBdr>
-        <w:top w:val="none" w:sz="0" w:space="0" w:color="auto"/>
-        <w:left w:val="none" w:sz="0" w:space="0" w:color="auto"/>
-        <w:bottom w:val="none" w:sz="0" w:space="0" w:color="auto"/>
-        <w:right w:val="none" w:sz="0" w:space="0" w:color="auto"/>
-      </w:divBdr>
-    </w:div>
-  </w:divs>
-  <w:optimizeForBrowser/>
-  <w:relyOnVML/>
-  <w:allowPNG/>
-</w:webSettings>
-</file>
-
-<file path=word\webextensions\taskpanes.xml><?xml version="1.0" encoding="utf-8"?>
+<file path=word/webextensions/taskpanes.xml><?xml version="1.0" encoding="utf-8"?>
 <wetp:taskpanes xmlns:wetp="http://schemas.microsoft.com/office/webextensions/taskpanes/2010/11">
   <wetp:taskpane dockstate="right" visibility="0" width="350" row="2">
     <wetp:webextensionref xmlns:r="http://schemas.openxmlformats.org/officeDocument/2006/relationships" r:id="rId1"/>
@@ -9488,7 +8468,7 @@
 </wetp:taskpanes>
 </file>
 
-<file path=word\webextensions\webextension1.xml><?xml version="1.0" encoding="utf-8"?>
+<file path=word/webextensions/webextension1.xml><?xml version="1.0" encoding="utf-8"?>
 <we:webextension xmlns:we="http://schemas.microsoft.com/office/webextensions/webextension/2010/11" id="{0E22F6B3-63C6-4C00-BA2F-EAD7FF03F1F2}">
   <we:reference id="wa200010725" version="1.0.0.1" store="pt-BR" storeType="OMEX"/>
   <we:alternateReferences>
@@ -9500,4 +8480,16 @@
   <we:bindings/>
   <we:snapshot xmlns:r="http://schemas.openxmlformats.org/officeDocument/2006/relationships"/>
 </we:webextension>
+</file>
+
+<file path=customXml/item1.xml><?xml version="1.0" encoding="utf-8"?>
+<b:Sources xmlns:b="http://schemas.openxmlformats.org/officeDocument/2006/bibliography" xmlns="http://schemas.openxmlformats.org/officeDocument/2006/bibliography" SelectedStyle="\APASixthEditionOfficeOnline.xsl" StyleName="APA" Version="6"/>
+</file>
+
+<file path=customXml/itemProps1.xml><?xml version="1.0" encoding="utf-8"?>
+<ds:datastoreItem xmlns:ds="http://schemas.openxmlformats.org/officeDocument/2006/customXml" ds:itemID="{77CAD40A-37C4-45EB-863E-17792EDB9BB0}">
+  <ds:schemaRefs>
+    <ds:schemaRef ds:uri="http://schemas.openxmlformats.org/officeDocument/2006/bibliography"/>
+  </ds:schemaRefs>
+</ds:datastoreItem>
 </file>
</xml_diff>

<commit_message>
Gerador de contrato: nacionalidade, endereco em ambas as secoes, grau parentesco
- Template (.docx): adiciona {nacionalidade} nas secoes legal e financeiro,
  {enderecoResponsavel} e {bairroResponsavel}/{municipioResponsavel} na secao legal
  (antes so existiam na secao financeiro)
- Form: campo Nacionalidade (default Brasileira) e inicializacao correta
  de grauParentescoLegal como MESMO para maiores de idade
- useEffect: limpa grauParentescoLegal quando aluno vira menor de idade
- API: repassa nacionalidade ao template

Co-Authored-By: Claude Sonnet 4.6 <noreply@anthropic.com>
</commit_message>
<xml_diff>
--- a/lib/templates/contrato_template.docx
+++ b/lib/templates/contrato_template.docx
@@ -577,7 +577,7 @@
                 <w:sz w:val="24"/>
                 <w:szCs w:val="24"/>
               </w:rPr>
-              <w:t xml:space="preserve">:                      </w:t>
+              <w:t xml:space="preserve">: {nacionalidade}   </w:t>
             </w:r>
             <w:r>
               <w:rPr>
@@ -587,14 +587,6 @@
                 <w:szCs w:val="24"/>
               </w:rPr>
               <w:t xml:space="preserve">                                           </w:t>
-            </w:r>
-            <w:r>
-              <w:rPr>
-                <w:rFonts w:ascii="Arial" w:hAnsi="Arial" w:cs="Arial"/>
-                <w:sz w:val="24"/>
-                <w:szCs w:val="24"/>
-              </w:rPr>
-              <w:t xml:space="preserve">    </w:t>
             </w:r>
             <w:r>
               <w:rPr>
@@ -646,7 +638,7 @@
                 <w:sz w:val="24"/>
                 <w:szCs w:val="24"/>
               </w:rPr>
-              <w:t xml:space="preserve">:                             </w:t>
+              <w:t xml:space="preserve">: {enderecoResponsavel}</w:t>
               <w:br/>
             </w:r>
           </w:p>
@@ -687,7 +679,7 @@
                 <w:sz w:val="24"/>
                 <w:szCs w:val="24"/>
               </w:rPr>
-              <w:t xml:space="preserve">:                     </w:t>
+              <w:t xml:space="preserve">: {bairroResponsavel}   </w:t>
             </w:r>
             <w:r>
               <w:rPr>
@@ -705,7 +697,7 @@
                 <w:sz w:val="24"/>
                 <w:szCs w:val="24"/>
               </w:rPr>
-              <w:t xml:space="preserve">                                                         </w:t>
+              <w:t xml:space="preserve"> {municipioResponsavel}   </w:t>
             </w:r>
             <w:r>
               <w:rPr>
@@ -1105,7 +1097,7 @@
                 <w:sz w:val="24"/>
                 <w:szCs w:val="24"/>
               </w:rPr>
-              <w:t xml:space="preserve">                                  </w:t>
+              <w:t xml:space="preserve"> {nacionalidade}   </w:t>
             </w:r>
             <w:r>
               <w:rPr>

</xml_diff>

<commit_message>
fix(contrato): preencher endereço em ambos os blocos (legal e financeiro)
Antes o endereço só aparecia em um dos campos; agora o template usa placeholders
distintos para responsável legal e financeiro, com fallback automático quando são
a mesma pessoa. Adiciona seção condicional no formulário para quando o responsável
financeiro for diferente do legal.

Co-Authored-By: Claude Sonnet 4.6 <noreply@anthropic.com>
</commit_message>
<xml_diff>
--- a/lib/templates/contrato_template.docx
+++ b/lib/templates/contrato_template.docx
@@ -586,16 +586,7 @@
                 <w:sz w:val="24"/>
                 <w:szCs w:val="24"/>
               </w:rPr>
-              <w:t xml:space="preserve">                                           </w:t>
-            </w:r>
-            <w:r>
-              <w:rPr>
-                <w:rFonts w:ascii="Arial" w:hAnsi="Arial" w:cs="Arial"/>
-                <w:b/>
-                <w:sz w:val="24"/>
-                <w:szCs w:val="24"/>
-              </w:rPr>
-              <w:t>Estado Civil:</w:t>
+              <w:t xml:space="preserve">                                           Estado Civil:</w:t>
             </w:r>
           </w:p>
         </w:tc>
@@ -1175,7 +1166,7 @@
                 <w:sz w:val="24"/>
                 <w:szCs w:val="24"/>
               </w:rPr>
-              <w:t xml:space="preserve">Endereço residencial: {enderecoResponsavel}</w:t>
+              <w:t xml:space="preserve">Endereço residencial: {enderecoResponsavelFinanceiro}</w:t>
             </w:r>
           </w:p>
         </w:tc>
@@ -1205,7 +1196,7 @@
                 <w:sz w:val="24"/>
                 <w:szCs w:val="24"/>
               </w:rPr>
-              <w:t>Bairro: {bairroResponsavel}   Município: {municipioResponsavel}</w:t>
+              <w:t>Bairro: {bairroResponsavelFinanceiro}   Município: {municipioResponsavelFinanceiro}</w:t>
             </w:r>
             <w:r>
               <w:rPr>

</xml_diff>

<commit_message>
fix(contrato): CPF, nascimento e número do responsável financeiro
Template não tinha placeholders para CPF, Nasc e Número no bloco
financeiro. Adicionados {cpfResponsavelFinanceiro}, {nascResponsavelFinanceiro}
e {numeroResponsavelFinanceiro}. API e formulário atualizados.

Co-Authored-By: Claude Sonnet 4.6 <noreply@anthropic.com>
</commit_message>
<xml_diff>
--- a/lib/templates/contrato_template.docx
+++ b/lib/templates/contrato_template.docx
@@ -569,7 +569,7 @@
                 <w:sz w:val="24"/>
                 <w:szCs w:val="24"/>
               </w:rPr>
-              <w:t>Nacionalidade</w:t>
+              <w:t xml:space="preserve">Nacionalidade: {nacionalidade}   </w:t>
             </w:r>
             <w:r>
               <w:rPr>
@@ -1038,7 +1038,7 @@
                 <w:sz w:val="24"/>
                 <w:szCs w:val="24"/>
               </w:rPr>
-              <w:t>:</w:t>
+              <w:t>: {cpfResponsavelFinanceiro}</w:t>
             </w:r>
             <w:r>
               <w:rPr>
@@ -1050,7 +1050,7 @@
               </w:rPr>
               <w:t xml:space="preserve"> </w:t>
               <w:br/>
-              <w:t xml:space="preserve">Nasc: </w:t>
+              <w:t xml:space="preserve">Nasc: {nascResponsavelFinanceiro}</w:t>
             </w:r>
           </w:p>
         </w:tc>
@@ -1106,7 +1106,7 @@
                 <w:sz w:val="24"/>
                 <w:szCs w:val="24"/>
               </w:rPr>
-              <w:t xml:space="preserve">                  </w:t>
+              <w:t xml:space="preserve"> {nacionalidade}   </w:t>
             </w:r>
             <w:r>
               <w:rPr>
@@ -1273,7 +1273,7 @@
                 <w:sz w:val="24"/>
                 <w:szCs w:val="24"/>
               </w:rPr>
-              <w:t xml:space="preserve">:                                                          </w:t>
+              <w:t xml:space="preserve">: {numeroResponsavelFinanceiro}</w:t>
             </w:r>
             <w:r>
               <w:rPr>

</xml_diff>